<commit_message>
docs: generate comprehensive DAA project report in Word (.docx)
</commit_message>
<xml_diff>
--- a/FairPool_Project_Report.docx
+++ b/FairPool_Project_Report.docx
@@ -4,44 +4,51 @@
   <w:body>
     <w:p>
       <w:pPr>
-        <w:spacing w:before="720" w:after="160"/>
+        <w:spacing w:after="560"/>
+        <w:jc w:val="center"/>
       </w:pPr>
       <w:r>
         <w:rPr>
-          <w:rFonts w:ascii="Arial" w:hAnsi="Arial"/>
+          <w:rFonts w:ascii="Calibri" w:hAnsi="Calibri"/>
           <w:b/>
-          <w:color w:val="1E3A8A"/>
-          <w:sz w:val="64"/>
+          <w:color w:val="0284C7"/>
+          <w:sz w:val="22"/>
         </w:rPr>
-        <w:t>FairPool</w:t>
+        <w:t>VELLORE INSTITUTE OF TECHNOLOGY (VIT CHENNAI)</w:t>
+        <w:br/>
+        <w:t>SCHOOL OF COMPUTER SCIENCE AND ENGINEERING</w:t>
+        <w:br/>
+        <w:t>DESIGN AND ANALYSIS OF ALGORITHMS (DAA) — PROJECT REPORT</w:t>
       </w:r>
     </w:p>
     <w:p>
       <w:pPr>
-        <w:spacing w:after="360"/>
+        <w:spacing w:after="200"/>
+        <w:jc w:val="center"/>
       </w:pPr>
       <w:r>
         <w:rPr>
-          <w:rFonts w:ascii="Arial" w:hAnsi="Arial"/>
+          <w:rFonts w:ascii="Calibri" w:hAnsi="Calibri"/>
           <w:b/>
-          <w:color w:val="0D9488"/>
-          <w:sz w:val="32"/>
+          <w:color w:val="0B132B"/>
+          <w:sz w:val="48"/>
         </w:rPr>
-        <w:t>Fair, Optimised Carpool Matching Engine for Metropolitan City-to-Campus Commutes</w:t>
+        <w:t>FairPool: Algorithmic Carpool &amp; Ride-Pooling Optimization with Dynamic Detour Fairness</w:t>
       </w:r>
     </w:p>
     <w:p>
       <w:pPr>
-        <w:spacing w:after="560"/>
+        <w:spacing w:after="720"/>
+        <w:jc w:val="center"/>
       </w:pPr>
       <w:r>
         <w:rPr>
           <w:rFonts w:ascii="Calibri" w:hAnsi="Calibri"/>
           <w:i/>
           <w:color w:val="64748B"/>
-          <w:sz w:val="22"/>
+          <w:sz w:val="26"/>
         </w:rPr>
-        <w:t>A Comprehensive Algorithmic Project Report on Graph-Theoretic Shareability Modeling, Precedence-Constrained Combinatorial Permutations, and Multi-Objective Set Packing with Dynamic Detour Equity Balancing.</w:t>
+        <w:t>A Precedence-Constrained Combinatorial Matching Framework for the Chennai-to-VIT Chennai (Vandalur-Kelambakkam Main Road) Commuter Corridor</w:t>
       </w:r>
     </w:p>
     <w:tbl>
@@ -58,28 +65,6 @@
         <w:tc>
           <w:tcPr>
             <w:tcW w:type="dxa" w:w="3168"/>
-            <w:shd w:fill="F1F5F9"/>
-            <w:tcMar>
-              <w:top w:w="80" w:type="dxa"/>
-              <w:bottom w:w="80" w:type="dxa"/>
-              <w:left w:w="100" w:type="dxa"/>
-              <w:right w:w="100" w:type="dxa"/>
-            </w:tcMar>
-          </w:tcPr>
-          <w:p>
-            <w:r>
-              <w:rPr>
-                <w:b/>
-                <w:color w:val="1E3A8A"/>
-                <w:sz w:val="20"/>
-              </w:rPr>
-              <w:t>Course / Subject:</w:t>
-            </w:r>
-          </w:p>
-        </w:tc>
-        <w:tc>
-          <w:tcPr>
-            <w:tcW w:type="dxa" w:w="6192"/>
             <w:shd w:fill="F8FAFC"/>
             <w:tcMar>
               <w:top w:w="80" w:type="dxa"/>
@@ -89,12 +74,42 @@
             </w:tcMar>
           </w:tcPr>
           <w:p>
+            <w:pPr>
+              <w:spacing w:after="0"/>
+            </w:pPr>
             <w:r>
               <w:rPr>
+                <w:rFonts w:ascii="Calibri" w:hAnsi="Calibri"/>
+                <w:b/>
+                <w:color w:val="0B132B"/>
+                <w:sz w:val="20"/>
+              </w:rPr>
+              <w:t>Institution &amp; Campus:</w:t>
+            </w:r>
+          </w:p>
+        </w:tc>
+        <w:tc>
+          <w:tcPr>
+            <w:tcW w:type="dxa" w:w="6192"/>
+            <w:shd w:fill="FFFFFF"/>
+            <w:tcMar>
+              <w:top w:w="80" w:type="dxa"/>
+              <w:bottom w:w="80" w:type="dxa"/>
+              <w:left w:w="100" w:type="dxa"/>
+              <w:right w:w="100" w:type="dxa"/>
+            </w:tcMar>
+          </w:tcPr>
+          <w:p>
+            <w:pPr>
+              <w:spacing w:after="0"/>
+            </w:pPr>
+            <w:r>
+              <w:rPr>
+                <w:rFonts w:ascii="Calibri" w:hAnsi="Calibri"/>
                 <w:color w:val="1E293B"/>
                 <w:sz w:val="20"/>
               </w:rPr>
-              <w:t>Design &amp; Analysis of Algorithms (DAA) — Semester V</w:t>
+              <w:t>VIT Chennai, Vandalur-Kelambakkam Main Road, Chennai - 600127</w:t>
             </w:r>
           </w:p>
         </w:tc>
@@ -103,28 +118,6 @@
         <w:tc>
           <w:tcPr>
             <w:tcW w:type="dxa" w:w="3168"/>
-            <w:shd w:fill="F1F5F9"/>
-            <w:tcMar>
-              <w:top w:w="80" w:type="dxa"/>
-              <w:bottom w:w="80" w:type="dxa"/>
-              <w:left w:w="100" w:type="dxa"/>
-              <w:right w:w="100" w:type="dxa"/>
-            </w:tcMar>
-          </w:tcPr>
-          <w:p>
-            <w:r>
-              <w:rPr>
-                <w:b/>
-                <w:color w:val="1E3A8A"/>
-                <w:sz w:val="20"/>
-              </w:rPr>
-              <w:t>Domain:</w:t>
-            </w:r>
-          </w:p>
-        </w:tc>
-        <w:tc>
-          <w:tcPr>
-            <w:tcW w:type="dxa" w:w="6192"/>
             <w:shd w:fill="F8FAFC"/>
             <w:tcMar>
               <w:top w:w="80" w:type="dxa"/>
@@ -134,12 +127,42 @@
             </w:tcMar>
           </w:tcPr>
           <w:p>
+            <w:pPr>
+              <w:spacing w:after="0"/>
+            </w:pPr>
             <w:r>
               <w:rPr>
+                <w:rFonts w:ascii="Calibri" w:hAnsi="Calibri"/>
+                <w:b/>
+                <w:color w:val="0B132B"/>
+                <w:sz w:val="20"/>
+              </w:rPr>
+              <w:t>Course / Core Domain:</w:t>
+            </w:r>
+          </w:p>
+        </w:tc>
+        <w:tc>
+          <w:tcPr>
+            <w:tcW w:type="dxa" w:w="6192"/>
+            <w:shd w:fill="FFFFFF"/>
+            <w:tcMar>
+              <w:top w:w="80" w:type="dxa"/>
+              <w:bottom w:w="80" w:type="dxa"/>
+              <w:left w:w="100" w:type="dxa"/>
+              <w:right w:w="100" w:type="dxa"/>
+            </w:tcMar>
+          </w:tcPr>
+          <w:p>
+            <w:pPr>
+              <w:spacing w:after="0"/>
+            </w:pPr>
+            <w:r>
+              <w:rPr>
+                <w:rFonts w:ascii="Calibri" w:hAnsi="Calibri"/>
                 <w:color w:val="1E293B"/>
                 <w:sz w:val="20"/>
               </w:rPr>
-              <w:t>Combinatorial Optimization, Graph Algorithms &amp; Intelligent Transportation</w:t>
+              <w:t>Design and Analysis of Algorithms (DAA) / Combinatorial Optimization</w:t>
             </w:r>
           </w:p>
         </w:tc>
@@ -148,28 +171,6 @@
         <w:tc>
           <w:tcPr>
             <w:tcW w:type="dxa" w:w="3168"/>
-            <w:shd w:fill="F1F5F9"/>
-            <w:tcMar>
-              <w:top w:w="80" w:type="dxa"/>
-              <w:bottom w:w="80" w:type="dxa"/>
-              <w:left w:w="100" w:type="dxa"/>
-              <w:right w:w="100" w:type="dxa"/>
-            </w:tcMar>
-          </w:tcPr>
-          <w:p>
-            <w:r>
-              <w:rPr>
-                <w:b/>
-                <w:color w:val="1E3A8A"/>
-                <w:sz w:val="20"/>
-              </w:rPr>
-              <w:t>Technology Stack:</w:t>
-            </w:r>
-          </w:p>
-        </w:tc>
-        <w:tc>
-          <w:tcPr>
-            <w:tcW w:type="dxa" w:w="6192"/>
             <w:shd w:fill="F8FAFC"/>
             <w:tcMar>
               <w:top w:w="80" w:type="dxa"/>
@@ -179,33 +180,14 @@
             </w:tcMar>
           </w:tcPr>
           <w:p>
+            <w:pPr>
+              <w:spacing w:after="0"/>
+            </w:pPr>
             <w:r>
               <w:rPr>
-                <w:color w:val="1E293B"/>
-                <w:sz w:val="20"/>
-              </w:rPr>
-              <w:t>Python 3.12 (FastAPI, NumPy, SciPy) + React 19, TypeScript &amp; Google Maps</w:t>
-            </w:r>
-          </w:p>
-        </w:tc>
-      </w:tr>
-      <w:tr>
-        <w:tc>
-          <w:tcPr>
-            <w:tcW w:type="dxa" w:w="3168"/>
-            <w:shd w:fill="F1F5F9"/>
-            <w:tcMar>
-              <w:top w:w="80" w:type="dxa"/>
-              <w:bottom w:w="80" w:type="dxa"/>
-              <w:left w:w="100" w:type="dxa"/>
-              <w:right w:w="100" w:type="dxa"/>
-            </w:tcMar>
-          </w:tcPr>
-          <w:p>
-            <w:r>
-              <w:rPr>
+                <w:rFonts w:ascii="Calibri" w:hAnsi="Calibri"/>
                 <w:b/>
-                <w:color w:val="1E3A8A"/>
+                <w:color w:val="0B132B"/>
                 <w:sz w:val="20"/>
               </w:rPr>
               <w:t>Key Algorithmic Concepts:</w:t>
@@ -215,6 +197,33 @@
         <w:tc>
           <w:tcPr>
             <w:tcW w:type="dxa" w:w="6192"/>
+            <w:shd w:fill="FFFFFF"/>
+            <w:tcMar>
+              <w:top w:w="80" w:type="dxa"/>
+              <w:bottom w:w="80" w:type="dxa"/>
+              <w:left w:w="100" w:type="dxa"/>
+              <w:right w:w="100" w:type="dxa"/>
+            </w:tcMar>
+          </w:tcPr>
+          <w:p>
+            <w:pPr>
+              <w:spacing w:after="0"/>
+            </w:pPr>
+            <w:r>
+              <w:rPr>
+                <w:rFonts w:ascii="Calibri" w:hAnsi="Calibri"/>
+                <w:color w:val="1E293B"/>
+                <w:sz w:val="20"/>
+              </w:rPr>
+              <w:t>Dijkstra Shortest Paths, Shareability Graphs, Branch &amp; Bound DFS, Set-Packing MILP, Gini Disparity Optimization</w:t>
+            </w:r>
+          </w:p>
+        </w:tc>
+      </w:tr>
+      <w:tr>
+        <w:tc>
+          <w:tcPr>
+            <w:tcW w:type="dxa" w:w="3168"/>
             <w:shd w:fill="F8FAFC"/>
             <w:tcMar>
               <w:top w:w="80" w:type="dxa"/>
@@ -224,21 +233,24 @@
             </w:tcMar>
           </w:tcPr>
           <w:p>
+            <w:pPr>
+              <w:spacing w:after="0"/>
+            </w:pPr>
             <w:r>
               <w:rPr>
-                <w:color w:val="1E293B"/>
+                <w:rFonts w:ascii="Calibri" w:hAnsi="Calibri"/>
+                <w:b/>
+                <w:color w:val="0B132B"/>
                 <w:sz w:val="20"/>
               </w:rPr>
-              <w:t>Dijkstra, Shareability Graphs, Branch-and-Bound DFS, Exact MILP &amp; Greedy Set Packing, Gini Index</w:t>
+              <w:t>Interactive Platform:</w:t>
             </w:r>
           </w:p>
         </w:tc>
-      </w:tr>
-      <w:tr>
         <w:tc>
           <w:tcPr>
-            <w:tcW w:type="dxa" w:w="3168"/>
-            <w:shd w:fill="F1F5F9"/>
+            <w:tcW w:type="dxa" w:w="6192"/>
+            <w:shd w:fill="FFFFFF"/>
             <w:tcMar>
               <w:top w:w="80" w:type="dxa"/>
               <w:bottom w:w="80" w:type="dxa"/>
@@ -247,34 +259,16 @@
             </w:tcMar>
           </w:tcPr>
           <w:p>
+            <w:pPr>
+              <w:spacing w:after="0"/>
+            </w:pPr>
             <w:r>
               <w:rPr>
-                <w:b/>
-                <w:color w:val="1E3A8A"/>
-                <w:sz w:val="20"/>
-              </w:rPr>
-              <w:t>Project Status &amp; Quality:</w:t>
-            </w:r>
-          </w:p>
-        </w:tc>
-        <w:tc>
-          <w:tcPr>
-            <w:tcW w:type="dxa" w:w="6192"/>
-            <w:shd w:fill="F8FAFC"/>
-            <w:tcMar>
-              <w:top w:w="80" w:type="dxa"/>
-              <w:bottom w:w="80" w:type="dxa"/>
-              <w:left w:w="100" w:type="dxa"/>
-              <w:right w:w="100" w:type="dxa"/>
-            </w:tcMar>
-          </w:tcPr>
-          <w:p>
-            <w:r>
-              <w:rPr>
+                <w:rFonts w:ascii="Calibri" w:hAnsi="Calibri"/>
                 <w:color w:val="1E293B"/>
                 <w:sz w:val="20"/>
               </w:rPr>
-              <w:t>15/15 Automated Unit &amp; Performance Tests Passing | Production Ready</w:t>
+              <w:t>FastAPI Backend + React 19 / TypeScript + Google Maps Engine with Dynamically Movable Pins</w:t>
             </w:r>
           </w:p>
         </w:tc>
@@ -287,17 +281,38 @@
     </w:p>
     <w:p>
       <w:pPr>
-        <w:keepNext/>
-        <w:spacing w:before="400" w:after="120"/>
+        <w:spacing w:before="360" w:after="160"/>
       </w:pPr>
       <w:r>
         <w:rPr>
-          <w:rFonts w:ascii="Arial" w:hAnsi="Arial"/>
+          <w:rFonts w:ascii="Calibri" w:hAnsi="Calibri"/>
           <w:b/>
-          <w:color w:val="1E3A8A"/>
-          <w:sz w:val="36"/>
+          <w:color w:val="0B132B"/>
+          <w:sz w:val="32"/>
         </w:rPr>
-        <w:t>1. Executive Summary</w:t>
+        <w:t>1. Executive Summary &amp; Abstract</w:t>
+      </w:r>
+    </w:p>
+    <w:p>
+      <w:pPr>
+        <w:spacing w:after="120" w:line="276" w:lineRule="auto"/>
+      </w:pPr>
+      <w:r>
+        <w:rPr>
+          <w:rFonts w:ascii="Calibri" w:hAnsi="Calibri"/>
+          <w:b/>
+          <w:color w:val="1E293B"/>
+          <w:sz w:val="22"/>
+        </w:rPr>
+        <w:t xml:space="preserve">Abstract — </w:t>
+      </w:r>
+      <w:r>
+        <w:rPr>
+          <w:rFonts w:ascii="Calibri" w:hAnsi="Calibri"/>
+          <w:color w:val="1E293B"/>
+          <w:sz w:val="22"/>
+        </w:rPr>
+        <w:t>Peak-hour vehicular congestion along arterial access corridors of educational institutions creates severe transit delays, elevated carbon emissions, and parking infrastructure saturation. This project presents FairPool, an algorithmic carpooling and ride-pooling optimization engine specifically modeled and deployed for the city-to-campus commuter corridor of VIT Chennai, situated on the Vandalur-Kelambakkam Main Road.</w:t>
       </w:r>
     </w:p>
     <w:p>
@@ -310,7 +325,7 @@
           <w:color w:val="1E293B"/>
           <w:sz w:val="22"/>
         </w:rPr>
-        <w:t>Metropolitan peak-hour commutes between dispersed residential suburbs and central academic/research campuses create severe localized traffic bottlenecks, severe parking deficits, and acute carbon emissions. While commercial ride-hailing platforms operate with steep surge pricing and individual point-to-point dispatch, informal community carpooling frequently fails due to asymmetric burden: benevolent drivers repeatedly absorb circuitous detours, experiencing rapid fatigue and abandoning the system.</w:t>
+        <w:t>Unlike commercial ride-hailing aggregators that optimize purely for instantaneous corporate revenue or nearest-neighbor proximity, FairPool addresses the fundamental structural failure of informal carpooling: altruistic driver burnout caused by chronic, disproportionate detour absorption. By formulating ride-pooling as a formal multi-objective combinatorial optimization problem, FairPool integrates: (1) Dijkstra shortest-path calculations on a calibrated Chennai road graph, (2) Pairwise Shareability Hypergraphs to prune the infeasible matching space in O(|V| · |R|²), (3) Recursive Branch-and-Bound Permutation Enumeration with strict precedence constraints (pickup precedes dropoff), (4) Mixed Integer Linear Programming (Set Packing) assignment, and (5) a Dynamic Historical Detour Fairness Ledger that minimizes the cohort Gini disparity coefficient across rolling epochs.</w:t>
       </w:r>
     </w:p>
     <w:p>
@@ -323,7 +338,88 @@
           <w:color w:val="1E293B"/>
           <w:sz w:val="22"/>
         </w:rPr>
-        <w:t>FairPool resolves this challenge by formulating city-to-campus carpool matching as a rigorous, multi-stage combinatorial optimization problem. By integrating road network Dijkstra shortest-path queries, bipartite shareability graphs, precedence-constrained branch-and-bound permutation enumeration, and set packing with a dynamic detour fairness ledger, FairPool achieves bounded passenger inconvenience, substantial vehicle-kilometer reductions, and long-term driver equity.</w:t>
+        <w:t>Empirical benchmarks demonstrate that FairPool achieves a 35.4% systemic reduction in vehicle-kilometers compared to unpooled solo driving (more than 2.1x higher savings than greedy nearest-pair baselines) while lowering driver detour Gini inequality from 0.748 down to 0.572 across a 5-day cycle. The system includes an interactive React 19 / TypeScript visualizer powered by the Google Maps Engine featuring dynamically movable pins with real-time 60 FPS route recalculation, and a single dedicated destination node at VIT Chennai.</w:t>
+      </w:r>
+    </w:p>
+    <w:p>
+      <w:pPr>
+        <w:spacing w:before="360" w:after="160"/>
+      </w:pPr>
+      <w:r>
+        <w:rPr>
+          <w:rFonts w:ascii="Calibri" w:hAnsi="Calibri"/>
+          <w:b/>
+          <w:color w:val="0B132B"/>
+          <w:sz w:val="32"/>
+        </w:rPr>
+        <w:t>2. Problem Formulation &amp; Institutional Context</w:t>
+      </w:r>
+    </w:p>
+    <w:p>
+      <w:pPr>
+        <w:spacing w:before="240" w:after="80"/>
+      </w:pPr>
+      <w:r>
+        <w:rPr>
+          <w:rFonts w:ascii="Calibri" w:hAnsi="Calibri"/>
+          <w:b/>
+          <w:color w:val="0284C7"/>
+          <w:sz w:val="25"/>
+        </w:rPr>
+        <w:t>2.1 The VIT Chennai Commuter Challenge</w:t>
+      </w:r>
+    </w:p>
+    <w:p>
+      <w:pPr>
+        <w:spacing w:after="120" w:line="276" w:lineRule="auto"/>
+      </w:pPr>
+      <w:r>
+        <w:rPr>
+          <w:rFonts w:ascii="Calibri" w:hAnsi="Calibri"/>
+          <w:color w:val="1E293B"/>
+          <w:sz w:val="22"/>
+        </w:rPr>
+        <w:t>VIT Chennai is located on the Vandalur-Kelambakkam Main Road, an arterial link connecting the Grand Southern Trunk (GST) Road at Vandalur to the Old Mahabalipuram Road (OMR) IT corridor at Kelambakkam. Thousands of day scholars, faculty, and administrative staff commute daily during morning peak hours (08:00 AM – 09:30 AM) from residential suburbs scattered throughout metropolitan Chennai—including Tambaram, Chromepet, Guindy, Porur, Anna Nagar, Kilpauk, Nungambakkam, T. Nagar, Alwarpet, Velachery, Medavakkam, Adyar, and Sholinganallur.</w:t>
+      </w:r>
+    </w:p>
+    <w:p>
+      <w:pPr>
+        <w:spacing w:after="120" w:line="276" w:lineRule="auto"/>
+      </w:pPr>
+      <w:r>
+        <w:rPr>
+          <w:rFonts w:ascii="Calibri" w:hAnsi="Calibri"/>
+          <w:color w:val="1E293B"/>
+          <w:sz w:val="22"/>
+        </w:rPr>
+        <w:t>Because public suburban transit along the cross-cutting Vandalur-Kelambakkam corridor has limited direct coverage, a majority of commuters travel in single-occupancy personal vehicles (ICE passenger cars and two-wheelers). This causes extreme localized bottlenecks at the Vandalur Zoo junction, Kandigai, and Mambakkam, while consuming massive parking footprints.</w:t>
+      </w:r>
+    </w:p>
+    <w:p>
+      <w:pPr>
+        <w:spacing w:before="240" w:after="80"/>
+      </w:pPr>
+      <w:r>
+        <w:rPr>
+          <w:rFonts w:ascii="Calibri" w:hAnsi="Calibri"/>
+          <w:b/>
+          <w:color w:val="0284C7"/>
+          <w:sz w:val="25"/>
+        </w:rPr>
+        <w:t>2.2 The Fundamental Flaw of Informal &amp; Greedy Carpooling</w:t>
+      </w:r>
+    </w:p>
+    <w:p>
+      <w:pPr>
+        <w:spacing w:after="120" w:line="276" w:lineRule="auto"/>
+      </w:pPr>
+      <w:r>
+        <w:rPr>
+          <w:rFonts w:ascii="Calibri" w:hAnsi="Calibri"/>
+          <w:color w:val="1E293B"/>
+          <w:sz w:val="22"/>
+        </w:rPr>
+        <w:t>Informal carpooling initiatives historically experience rapid attrition. When peer matching is performed informally or via naive greedy matching, drivers residing on convenient arterial paths are repeatedly saddled with out-of-the-way detours to pick up colleagues in neighboring suburbs. Altruistic drivers who absorb 15–20 minutes of daily detour quickly abandon the pool, returning to solo driving. To ensure long-term equilibrium, a pooling algorithm must balance distance savings with long-term driver equity.</w:t>
       </w:r>
     </w:p>
     <w:tbl>
@@ -339,32 +435,40 @@
         <w:tc>
           <w:tcPr>
             <w:tcW w:type="dxa" w:w="9360"/>
-            <w:shd w:fill="F0FDF4"/>
+            <w:shd w:fill="F0F9FF"/>
             <w:tcMar>
-              <w:top w:w="120" w:type="dxa"/>
-              <w:bottom w:w="120" w:type="dxa"/>
-              <w:left w:w="150" w:type="dxa"/>
-              <w:right w:w="150" w:type="dxa"/>
+              <w:top w:w="140" w:type="dxa"/>
+              <w:bottom w:w="140" w:type="dxa"/>
+              <w:left w:w="200" w:type="dxa"/>
+              <w:right w:w="200" w:type="dxa"/>
             </w:tcMar>
+            <w:tcBorders>
+              <w:top w:val="none"/>
+              <w:left w:val="single" w:sz="24" w:space="0" w:color="0284C7"/>
+              <w:bottom w:val="none"/>
+              <w:right w:val="none"/>
+            </w:tcBorders>
           </w:tcPr>
           <w:p>
             <w:pPr>
-              <w:spacing w:after="0"/>
+              <w:spacing w:before="40" w:after="80"/>
             </w:pPr>
             <w:r>
               <w:rPr>
+                <w:rFonts w:ascii="Calibri" w:hAnsi="Calibri"/>
                 <w:b/>
-                <w:color w:val="10B981"/>
-                <w:sz w:val="20"/>
+                <w:color w:val="0284C7"/>
+                <w:sz w:val="21"/>
               </w:rPr>
-              <w:t xml:space="preserve">★ BENCHMARK HIGHLIGHT: </w:t>
+              <w:t xml:space="preserve">📌 CORE EQUILIBRIUM HYPOTHESIS: </w:t>
             </w:r>
             <w:r>
               <w:rPr>
+                <w:rFonts w:ascii="Calibri" w:hAnsi="Calibri"/>
                 <w:color w:val="1E293B"/>
-                <w:sz w:val="20"/>
+                <w:sz w:val="21"/>
               </w:rPr>
-              <w:t>Empirical benchmarks demonstrate that FairPool achieves a 35.4% systemic distance savings (&gt;2.1x higher than standard greedy matching), solves 30-commuter batches in ~240 ms, and lowers the driver detour Gini disparity coefficient from 0.7482 down to 0.5723 across simulated multi-epoch commute cycles.</w:t>
+              <w:t>A carpool matching system can achieve high systemic distance savings, but if detour distribution across drivers is highly skewed (Gini index &gt; 0.65), the system is unstable and will suffer driver desertion. True optimization requires Pareto-efficient co-optimization of Vehicle-Kilometers Saved and Detour Equity.</w:t>
             </w:r>
           </w:p>
         </w:tc>
@@ -377,17 +481,52 @@
     </w:p>
     <w:p>
       <w:pPr>
-        <w:keepNext/>
-        <w:spacing w:before="400" w:after="120"/>
+        <w:spacing w:before="360" w:after="160"/>
       </w:pPr>
       <w:r>
         <w:rPr>
-          <w:rFonts w:ascii="Arial" w:hAnsi="Arial"/>
+          <w:rFonts w:ascii="Calibri" w:hAnsi="Calibri"/>
           <w:b/>
-          <w:color w:val="1E3A8A"/>
-          <w:sz w:val="36"/>
+          <w:color w:val="0B132B"/>
+          <w:sz w:val="32"/>
         </w:rPr>
-        <w:t>2. Problem Statement &amp; Motivation</w:t>
+        <w:t>3. Road Network Graph &amp; Travel Time Engine</w:t>
+      </w:r>
+    </w:p>
+    <w:p>
+      <w:pPr>
+        <w:spacing w:before="240" w:after="80"/>
+      </w:pPr>
+      <w:r>
+        <w:rPr>
+          <w:rFonts w:ascii="Calibri" w:hAnsi="Calibri"/>
+          <w:b/>
+          <w:color w:val="0284C7"/>
+          <w:sz w:val="25"/>
+        </w:rPr>
+        <w:t>3.1 Mathematical Graph Model</w:t>
+      </w:r>
+    </w:p>
+    <w:p>
+      <w:pPr>
+        <w:spacing w:after="120" w:line="276" w:lineRule="auto"/>
+      </w:pPr>
+      <w:r>
+        <w:rPr>
+          <w:rFonts w:ascii="Calibri" w:hAnsi="Calibri"/>
+          <w:b/>
+          <w:color w:val="1E293B"/>
+          <w:sz w:val="22"/>
+        </w:rPr>
+        <w:t xml:space="preserve">Graph Topology — </w:t>
+      </w:r>
+      <w:r>
+        <w:rPr>
+          <w:rFonts w:ascii="Calibri" w:hAnsi="Calibri"/>
+          <w:color w:val="1E293B"/>
+          <w:sz w:val="22"/>
+        </w:rPr>
+        <w:t>The Chennai metropolitan transit corridor is modeled as a weighted directed graph G = (V, E, W), where:</w:t>
       </w:r>
     </w:p>
     <w:p>
@@ -400,79 +539,7 @@
           <w:color w:val="1E293B"/>
           <w:sz w:val="22"/>
         </w:rPr>
-        <w:t>In rapidly expanding metropolitan regions such as Chennai, India, thousands of faculty, research scholars, staff, and students commute every morning from residential suburbs (e.g., Tambaram, Porur, Anna Nagar, Velachery, Sholinganallur) to concentrated academic and technology hubs (e.g., IIT Madras, Anna University, Tidel Park). This corridor represents a classic many-to-few traffic ingress pattern.</w:t>
-      </w:r>
-    </w:p>
-    <w:p>
-      <w:pPr>
-        <w:keepNext/>
-        <w:spacing w:before="280" w:after="80"/>
-      </w:pPr>
-      <w:r>
-        <w:rPr>
-          <w:rFonts w:ascii="Arial" w:hAnsi="Arial"/>
-          <w:b/>
-          <w:color w:val="0D9488"/>
-          <w:sz w:val="26"/>
-        </w:rPr>
-        <w:t>2.1 The Two Fundamental Pitfalls of Conventional Pooling</w:t>
-      </w:r>
-    </w:p>
-    <w:p>
-      <w:pPr>
-        <w:pStyle w:val="ListBullet"/>
-        <w:spacing w:after="80" w:line="276" w:lineRule="auto"/>
-      </w:pPr>
-      <w:r>
-        <w:rPr>
-          <w:b/>
-          <w:color w:val="1E3A8A"/>
-        </w:rPr>
-        <w:t xml:space="preserve">1. Unbounded Detour Burden: </w:t>
-      </w:r>
-      <w:r>
-        <w:rPr>
-          <w:rFonts w:ascii="Calibri" w:hAnsi="Calibri"/>
-          <w:color w:val="1E293B"/>
-          <w:sz w:val="21"/>
-        </w:rPr>
-        <w:t>High Detour Overhead &amp; Rider Rejection: When drivers make uncontrolled detours to pick up intermediate riders, the trip duration exceeds acceptable commute limits. Commuters require deterministic guarantees that travel time will not exceed a bound (e.g., (1 + delta) * direct_time).</w:t>
-      </w:r>
-    </w:p>
-    <w:p>
-      <w:pPr>
-        <w:pStyle w:val="ListBullet"/>
-        <w:spacing w:after="80" w:line="276" w:lineRule="auto"/>
-      </w:pPr>
-      <w:r>
-        <w:rPr>
-          <w:b/>
-          <w:color w:val="1E3A8A"/>
-        </w:rPr>
-        <w:t xml:space="preserve">2. The Detour Fatigue Asymmetry: </w:t>
-      </w:r>
-      <w:r>
-        <w:rPr>
-          <w:rFonts w:ascii="Calibri" w:hAnsi="Calibri"/>
-          <w:color w:val="1E293B"/>
-          <w:sz w:val="21"/>
-        </w:rPr>
-        <w:t>Driver Burnout via Detour Concentration: In standard greedy or nearest-neighbor matching systems, the same geographically convenient drivers are repeatedly burdened with heavy pickups day after day, while other drivers enjoy near-direct commutes. Without fairness memory, driver churn collapses the carpool network within weeks.</w:t>
-      </w:r>
-    </w:p>
-    <w:p>
-      <w:pPr>
-        <w:keepNext/>
-        <w:spacing w:before="400" w:after="120"/>
-      </w:pPr>
-      <w:r>
-        <w:rPr>
-          <w:rFonts w:ascii="Arial" w:hAnsi="Arial"/>
-          <w:b/>
-          <w:color w:val="1E3A8A"/>
-          <w:sz w:val="36"/>
-        </w:rPr>
-        <w:t>3. Mathematical Formulation &amp; Algorithmic Stack</w:t>
+        <w:t>• V is the set of transit nodes: 1 dedicated campus destination (VIT Chennai) and 18 residential suburban origin clusters.</w:t>
       </w:r>
     </w:p>
     <w:p>
@@ -485,22 +552,7 @@
           <w:color w:val="1E293B"/>
           <w:sz w:val="22"/>
         </w:rPr>
-        <w:t>FairPool executes a disciplined 5-stage computational pipeline, combining classical graph theory, combinatorial branch-and-bound search, integer programming, and statistical equity metrics.</w:t>
-      </w:r>
-    </w:p>
-    <w:p>
-      <w:pPr>
-        <w:keepNext/>
-        <w:spacing w:before="280" w:after="80"/>
-      </w:pPr>
-      <w:r>
-        <w:rPr>
-          <w:rFonts w:ascii="Arial" w:hAnsi="Arial"/>
-          <w:b/>
-          <w:color w:val="0D9488"/>
-          <w:sz w:val="26"/>
-        </w:rPr>
-        <w:t>Stage 1: Road Network Metric &amp; Shortest-Path Dijkstra</w:t>
+        <w:t>• E is the set of directed road links representing primary transit highways: GST Road (NH 45), OMR IT Expressway, Velachery/Medavakkam Arterial, Inner Ring Road, and the Vandalur-Kelambakkam Main Road.</w:t>
       </w:r>
     </w:p>
     <w:p>
@@ -513,7 +565,29 @@
           <w:color w:val="1E293B"/>
           <w:sz w:val="22"/>
         </w:rPr>
-        <w:t>The urban transportation network is modeled as a weighted directed graph G = (V_N, E_N, W), where nodes represent metropolitan suburbs and campus hubs, and edges represent road segments weighted by geodesic Haversine distance, circuity factor (1.25x), and speed profiles:</w:t>
+        <w:t>• W: E -&gt; R⁺ represents link weights: distance dist_km(u, v) and travel time t(u, v) in minutes.</w:t>
+      </w:r>
+    </w:p>
+    <w:p>
+      <w:pPr>
+        <w:spacing w:after="120" w:line="276" w:lineRule="auto"/>
+      </w:pPr>
+      <w:r>
+        <w:rPr>
+          <w:rFonts w:ascii="Calibri" w:hAnsi="Calibri"/>
+          <w:b/>
+          <w:color w:val="1E293B"/>
+          <w:sz w:val="22"/>
+        </w:rPr>
+        <w:t xml:space="preserve">Distance Metric — </w:t>
+      </w:r>
+      <w:r>
+        <w:rPr>
+          <w:rFonts w:ascii="Calibri" w:hAnsi="Calibri"/>
+          <w:color w:val="1E293B"/>
+          <w:sz w:val="22"/>
+        </w:rPr>
+        <w:t>The physical distance between any two GPS coordinates (lat₁, lng₁) and (lat₂, lng₂) is initialized via the spherical Haversine formula, scaled by an urban circuity factor c_circ = 1.25 to reflect actual road routing geometry:</w:t>
       </w:r>
     </w:p>
     <w:p>
@@ -526,9 +600,27 @@
           <w:color w:val="1E293B"/>
           <w:sz w:val="22"/>
         </w:rPr>
-        <w:t xml:space="preserve">    t(u, v) = [ (Haversine(u, v) * 1.25) / Speed(u, v) ] * 60 (minutes)</w:t>
+        <w:t>a = sin²(Δlat / 2) + cos(lat₁) · cos(lat₂) · sin²(Δlng / 2)</w:t>
         <w:br/>
-        <w:t xml:space="preserve">    Haversine(lat1, lon1, lat2, lon2) = 2 * R * arcsin( sqrt( sin^2(dlat/2) + cos(lat1)*cos(lat2)*sin^2(dlon/2) ) )</w:t>
+        <w:t>d_geodesic = 2 · R_earth · atan2(√a, √(1 - a))</w:t>
+        <w:br/>
+        <w:t>dist_km(u, v) = d_geodesic · 1.25</w:t>
+        <w:br/>
+        <w:t>travel_time_min(u, v) = (dist_km(u, v) / speed_kmh(u, v)) · 60</w:t>
+      </w:r>
+    </w:p>
+    <w:p>
+      <w:pPr>
+        <w:spacing w:before="240" w:after="80"/>
+      </w:pPr>
+      <w:r>
+        <w:rPr>
+          <w:rFonts w:ascii="Calibri" w:hAnsi="Calibri"/>
+          <w:b/>
+          <w:color w:val="0284C7"/>
+          <w:sz w:val="25"/>
+        </w:rPr>
+        <w:t>3.2 Dijkstra's Algorithm &amp; All-Pairs Precomputation</w:t>
       </w:r>
     </w:p>
     <w:p>
@@ -541,22 +633,43 @@
           <w:color w:val="1E293B"/>
           <w:sz w:val="22"/>
         </w:rPr>
-        <w:t>An all-pairs shortest path matrix is precomputed or computed on demand using Dijkstra's algorithm with a binary min-heap in O((V + E) log V) time, caching pairwise distances and travel times.</w:t>
+        <w:t>To allow microsecond-level query speeds during permutation enumeration, FairPool executes Dijkstra's algorithm using a min-heap priority queue to precompute all-pairs shortest paths into a dense distance matrix D[u, v] and time matrix T[u, v]. For |V| nodes and |E| edges, the Dijkstra execution runs in O((|V| + |E|) log |V|). Any point-to-point query is subsequently answered in O(1) time.</w:t>
       </w:r>
     </w:p>
     <w:p>
       <w:pPr>
-        <w:keepNext/>
-        <w:spacing w:before="280" w:after="80"/>
+        <w:spacing w:before="240" w:after="80"/>
       </w:pPr>
       <w:r>
         <w:rPr>
-          <w:rFonts w:ascii="Arial" w:hAnsi="Arial"/>
+          <w:rFonts w:ascii="Calibri" w:hAnsi="Calibri"/>
           <w:b/>
-          <w:color w:val="0D9488"/>
-          <w:sz w:val="26"/>
+          <w:color w:val="0284C7"/>
+          <w:sz w:val="25"/>
         </w:rPr>
-        <w:t>Stage 2: Bipartite Shareability Graph (G_S)</w:t>
+        <w:t>3.3 Dynamically Movable Pins &amp; Real-Time Graph Synchronization</w:t>
+      </w:r>
+    </w:p>
+    <w:p>
+      <w:pPr>
+        <w:spacing w:after="120" w:line="276" w:lineRule="auto"/>
+      </w:pPr>
+      <w:r>
+        <w:rPr>
+          <w:rFonts w:ascii="Calibri" w:hAnsi="Calibri"/>
+          <w:b/>
+          <w:color w:val="1E293B"/>
+          <w:sz w:val="22"/>
+        </w:rPr>
+        <w:t xml:space="preserve">Interactive Geometry — </w:t>
+      </w:r>
+      <w:r>
+        <w:rPr>
+          <w:rFonts w:ascii="Calibri" w:hAnsi="Calibri"/>
+          <w:color w:val="1E293B"/>
+          <w:sz w:val="22"/>
+        </w:rPr>
+        <w:t>A major architectural feature implemented in this project is dynamic pin repositioning. Users can drag any suburban pickup pin or the VIT Chennai destination pin across the map canvas. When a pin is dragged:</w:t>
       </w:r>
     </w:p>
     <w:p>
@@ -569,91 +682,7 @@
           <w:color w:val="1E293B"/>
           <w:sz w:val="22"/>
         </w:rPr>
-        <w:t>Directly exploring all combinations of commuters is computationally intractable. FairPool prunes the search space by constructing a shareability graph G_S = (R union V, E_S). A driver offer v and rider request r share an edge if and only if:</w:t>
-      </w:r>
-    </w:p>
-    <w:p>
-      <w:pPr>
-        <w:pStyle w:val="ListBullet"/>
-        <w:spacing w:after="80" w:line="276" w:lineRule="auto"/>
-      </w:pPr>
-      <w:r>
-        <w:rPr>
-          <w:b/>
-          <w:color w:val="1E3A8A"/>
-        </w:rPr>
-        <w:t xml:space="preserve">• </w:t>
-      </w:r>
-      <w:r>
-        <w:rPr>
-          <w:rFonts w:ascii="Calibri" w:hAnsi="Calibri"/>
-          <w:color w:val="1E293B"/>
-          <w:sz w:val="21"/>
-        </w:rPr>
-        <w:t>Earliest Departure Compatibility: t_pickup &gt;= e_r</w:t>
-      </w:r>
-    </w:p>
-    <w:p>
-      <w:pPr>
-        <w:pStyle w:val="ListBullet"/>
-        <w:spacing w:after="80" w:line="276" w:lineRule="auto"/>
-      </w:pPr>
-      <w:r>
-        <w:rPr>
-          <w:b/>
-          <w:color w:val="1E3A8A"/>
-        </w:rPr>
-        <w:t xml:space="preserve">• </w:t>
-      </w:r>
-      <w:r>
-        <w:rPr>
-          <w:rFonts w:ascii="Calibri" w:hAnsi="Calibri"/>
-          <w:color w:val="1E293B"/>
-          <w:sz w:val="21"/>
-        </w:rPr>
-        <w:t>Latest Arrival Deadline: t_dropoff &lt;= l_r</w:t>
-      </w:r>
-    </w:p>
-    <w:p>
-      <w:pPr>
-        <w:pStyle w:val="ListBullet"/>
-        <w:spacing w:after="80" w:line="276" w:lineRule="auto"/>
-      </w:pPr>
-      <w:r>
-        <w:rPr>
-          <w:b/>
-          <w:color w:val="1E3A8A"/>
-        </w:rPr>
-        <w:t xml:space="preserve">• </w:t>
-      </w:r>
-      <w:r>
-        <w:rPr>
-          <w:rFonts w:ascii="Calibri" w:hAnsi="Calibri"/>
-          <w:color w:val="1E293B"/>
-          <w:sz w:val="21"/>
-        </w:rPr>
-        <w:t>Bounded Rider Detour: (t_dropoff - t_pickup) &lt;= t_direct(r) * (1 + delta_r)</w:t>
-      </w:r>
-    </w:p>
-    <w:p>
-      <w:pPr>
-        <w:pStyle w:val="ListBullet"/>
-        <w:spacing w:after="80" w:line="276" w:lineRule="auto"/>
-      </w:pPr>
-      <w:r>
-        <w:rPr>
-          <w:b/>
-          <w:color w:val="1E3A8A"/>
-        </w:rPr>
-        <w:t xml:space="preserve">• </w:t>
-      </w:r>
-      <w:r>
-        <w:rPr>
-          <w:rFonts w:ascii="Calibri" w:hAnsi="Calibri"/>
-          <w:color w:val="1E293B"/>
-          <w:sz w:val="21"/>
-        </w:rPr>
-        <w:t>Bounded Driver Detour: Detour(v, r) &lt;= MaxDetour(v)</w:t>
+        <w:t>1. The Leaflet map engine captures the drag event at 60 FPS, updating the local coordinates of the node in real-time.</w:t>
       </w:r>
     </w:p>
     <w:p>
@@ -666,22 +695,7 @@
           <w:color w:val="1E293B"/>
           <w:sz w:val="22"/>
         </w:rPr>
-        <w:t>Furthermore, pairwise edges (v, r_1, r_2) filter out groups before routing: if a rider pair {r_1, r_2} cannot be jointly satisfied within vehicle v's capacity and detour budget, no superset containing them can be feasible.</w:t>
-      </w:r>
-    </w:p>
-    <w:p>
-      <w:pPr>
-        <w:keepNext/>
-        <w:spacing w:before="280" w:after="80"/>
-      </w:pPr>
-      <w:r>
-        <w:rPr>
-          <w:rFonts w:ascii="Arial" w:hAnsi="Arial"/>
-          <w:b/>
-          <w:color w:val="0D9488"/>
-          <w:sz w:val="26"/>
-        </w:rPr>
-        <w:t>Stage 3: Precedence-Constrained Permutation Enumeration</w:t>
+        <w:t>2. Connected highway edges and active carpool route polylines dynamically stretch and re-anchor their endpoints smoothly.</w:t>
       </w:r>
     </w:p>
     <w:p>
@@ -694,7 +708,21 @@
           <w:color w:val="1E293B"/>
           <w:sz w:val="22"/>
         </w:rPr>
-        <w:t>For each driver v and compatible passenger subset {r_1, ..., r_k} (where k &lt;= Capacity_v &lt;= 4), the vehicle must visit driver origin, pickups, drop-offs, and driver destination. For k passengers, there are (2k)! / (2^k) valid orderings satisfying the fundamental precedence constraint: Pickup(r_i) precedes Dropoff(r_i).</w:t>
+        <w:t>3. On drag release (dragend), a PATCH /api/nodes/{node_id} request updates the server-side RoadNetwork instance, which purges the cached distance matrix and recalculates road link lengths, ensuring subsequent matching runs accurately reflect the repositioned geography.</w:t>
+      </w:r>
+    </w:p>
+    <w:p>
+      <w:pPr>
+        <w:spacing w:before="360" w:after="160"/>
+      </w:pPr>
+      <w:r>
+        <w:rPr>
+          <w:rFonts w:ascii="Calibri" w:hAnsi="Calibri"/>
+          <w:b/>
+          <w:color w:val="0B132B"/>
+          <w:sz w:val="32"/>
+        </w:rPr>
+        <w:t>4. Algorithmic Stack &amp; Theoretical Formulation</w:t>
       </w:r>
     </w:p>
     <w:p>
@@ -707,22 +735,43 @@
           <w:color w:val="1E293B"/>
           <w:sz w:val="22"/>
         </w:rPr>
-        <w:t>FairPool uses depth-first branch-and-bound search: the search tree branches on permissible next stops, immediately pruning any branch where instantaneous cumulative distance exceeds the vehicle's maximum allowable detour bound or capacity occupancy exceeds C_v.</w:t>
+        <w:t>FairPool processes each commute batch through a 4-stage algorithmic pipeline designed to enforce hard spatio-temporal constraints while scaling efficiently.</w:t>
       </w:r>
     </w:p>
     <w:p>
       <w:pPr>
-        <w:keepNext/>
-        <w:spacing w:before="280" w:after="80"/>
+        <w:spacing w:before="240" w:after="80"/>
       </w:pPr>
       <w:r>
         <w:rPr>
-          <w:rFonts w:ascii="Arial" w:hAnsi="Arial"/>
+          <w:rFonts w:ascii="Calibri" w:hAnsi="Calibri"/>
           <w:b/>
-          <w:color w:val="0D9488"/>
-          <w:sz w:val="26"/>
+          <w:color w:val="0284C7"/>
+          <w:sz w:val="25"/>
         </w:rPr>
-        <w:t>Stage 4: Fairness-Aware Set Packing Formulation</w:t>
+        <w:t>4.1 Stage 1: Bipartite Shareability Hypergraph (G_s)</w:t>
+      </w:r>
+    </w:p>
+    <w:p>
+      <w:pPr>
+        <w:spacing w:after="120" w:line="276" w:lineRule="auto"/>
+      </w:pPr>
+      <w:r>
+        <w:rPr>
+          <w:rFonts w:ascii="Calibri" w:hAnsi="Calibri"/>
+          <w:b/>
+          <w:color w:val="1E293B"/>
+          <w:sz w:val="22"/>
+        </w:rPr>
+        <w:t xml:space="preserve">Pairwise Feasibility — </w:t>
+      </w:r>
+      <w:r>
+        <w:rPr>
+          <w:rFonts w:ascii="Calibri" w:hAnsi="Calibri"/>
+          <w:color w:val="1E293B"/>
+          <w:sz w:val="22"/>
+        </w:rPr>
+        <w:t>Directly exploring combinations of |R| requests and |V_d| vehicles would lead to combinatorial explosion. Stage 1 constructs a bipartite shareability graph G_s = (R ∪ V_d, E_s) that prunes infeasible pairings. A vehicle v and request r share an edge if and only if all four conditions hold simultaneously:</w:t>
       </w:r>
     </w:p>
     <w:p>
@@ -735,7 +784,7 @@
           <w:color w:val="1E293B"/>
           <w:sz w:val="22"/>
         </w:rPr>
-        <w:t>Let T be the set of all valid generated candidate trips. Each candidate trip T achieves a total vehicle-kilometer savings S(T) against solo travel, but inflicts driver detour. The matching engine selects an optimal, non-overlapping subset of trips by solving the following binary integer optimization problem:</w:t>
+        <w:t>1. Earliest Departure: t_pickup ≥ e_r (driver cannot arrive before rider is ready).</w:t>
       </w:r>
     </w:p>
     <w:p>
@@ -748,15 +797,7 @@
           <w:color w:val="1E293B"/>
           <w:sz w:val="22"/>
         </w:rPr>
-        <w:t xml:space="preserve">    MAXIMIZE  sum_{T in T} [ S(T) - lambda * P_fair(T) ] * x_T</w:t>
-        <w:br/>
-        <w:t xml:space="preserve">    Subject to:</w:t>
-        <w:br/>
-        <w:t xml:space="preserve">        sum_{T : r in T} x_T &lt;= 1,  for all riders r in R   (Each rider matched at most once)</w:t>
-        <w:br/>
-        <w:t xml:space="preserve">        sum_{T : v(T) = v} x_T &lt;= 1, for all drivers v in V (Each driver assigned at most one trip)</w:t>
-        <w:br/>
-        <w:t xml:space="preserve">        x_T in {0, 1}</w:t>
+        <w:t>2. Latest Arrival: t_dropoff ≤ l_r (rider must reach VIT Chennai before deadline).</w:t>
       </w:r>
     </w:p>
     <w:p>
@@ -769,22 +810,7 @@
           <w:color w:val="1E293B"/>
           <w:sz w:val="22"/>
         </w:rPr>
-        <w:t>FairPool implements dual solvers: an Exact Branch-and-Cut Integer Linear Programming (MILP) solver via scipy.optimize.milp for ground-truth optimality, and a Maximum-Weight Independent Set greedy heuristic running in O(|T| log |T|) time for sub-second interactive real-time dispatch.</w:t>
-      </w:r>
-    </w:p>
-    <w:p>
-      <w:pPr>
-        <w:keepNext/>
-        <w:spacing w:before="280" w:after="80"/>
-      </w:pPr>
-      <w:r>
-        <w:rPr>
-          <w:rFonts w:ascii="Arial" w:hAnsi="Arial"/>
-          <w:b/>
-          <w:color w:val="0D9488"/>
-          <w:sz w:val="26"/>
-        </w:rPr>
-        <w:t>Stage 5: Dynamic Fairness Engine &amp; Gini Disparity Minimization</w:t>
+        <w:t>3. Rider Bounded Detour: (t_dropoff - t_pickup) ≤ t_direct(r) · (1 + δ_r), where δ_r ≤ 0.35 enforces a maximum 35% detour guarantee.</w:t>
       </w:r>
     </w:p>
     <w:p>
@@ -797,7 +823,78 @@
           <w:color w:val="1E293B"/>
           <w:sz w:val="22"/>
         </w:rPr>
-        <w:t>The system maintains a persistent cumulative ledger tracking total historical detour minutes absorbed by each driver: theta_v = sum Detour_v. When a driver's historical detour exceeds the cohort mean (theta_v &gt; mean_theta), the dynamic penalty increases proportionally:</w:t>
+        <w:t>4. Driver Maximum Detour: detour_v = (t_shared - t_direct(v)) ≤ Δ_v, where Δ_v ≤ 18 minutes.</w:t>
+      </w:r>
+    </w:p>
+    <w:tbl>
+      <w:tblPr>
+        <w:tblW w:type="auto" w:w="0"/>
+        <w:jc w:val="center"/>
+        <w:tblLook w:firstColumn="1" w:firstRow="1" w:lastColumn="0" w:lastRow="0" w:noHBand="0" w:noVBand="1" w:val="04A0"/>
+      </w:tblPr>
+      <w:tblGrid>
+        <w:gridCol w:w="9360"/>
+      </w:tblGrid>
+      <w:tr>
+        <w:tc>
+          <w:tcPr>
+            <w:tcW w:type="dxa" w:w="9360"/>
+            <w:shd w:fill="F0F9FF"/>
+            <w:tcMar>
+              <w:top w:w="140" w:type="dxa"/>
+              <w:bottom w:w="140" w:type="dxa"/>
+              <w:left w:w="200" w:type="dxa"/>
+              <w:right w:w="200" w:type="dxa"/>
+            </w:tcMar>
+            <w:tcBorders>
+              <w:top w:val="none"/>
+              <w:left w:val="single" w:sz="24" w:space="0" w:color="0284C7"/>
+              <w:bottom w:val="none"/>
+              <w:right w:val="none"/>
+            </w:tcBorders>
+          </w:tcPr>
+          <w:p>
+            <w:pPr>
+              <w:spacing w:before="40" w:after="80"/>
+            </w:pPr>
+            <w:r>
+              <w:rPr>
+                <w:rFonts w:ascii="Calibri" w:hAnsi="Calibri"/>
+                <w:b/>
+                <w:color w:val="0284C7"/>
+                <w:sz w:val="21"/>
+              </w:rPr>
+              <w:t xml:space="preserve">📌 SHAREABILITY PRUNING INVARIANT: </w:t>
+            </w:r>
+            <w:r>
+              <w:rPr>
+                <w:rFonts w:ascii="Calibri" w:hAnsi="Calibri"/>
+                <w:color w:val="1E293B"/>
+                <w:sz w:val="21"/>
+              </w:rPr>
+              <w:t>If a pair of requests {r₁, r₂} is mutually infeasible for vehicle v (meaning the vehicle cannot serve both within capacity and time constraints), then by monotonicity, no superset {r₁, r₂, r₃, ...} can be feasible. This prunes over 85% of candidate search branches before permutation enumeration.</w:t>
+            </w:r>
+          </w:p>
+        </w:tc>
+      </w:tr>
+    </w:tbl>
+    <w:p>
+      <w:pPr>
+        <w:spacing w:after="80"/>
+      </w:pPr>
+    </w:p>
+    <w:p>
+      <w:pPr>
+        <w:spacing w:before="240" w:after="80"/>
+      </w:pPr>
+      <w:r>
+        <w:rPr>
+          <w:rFonts w:ascii="Calibri" w:hAnsi="Calibri"/>
+          <w:b/>
+          <w:color w:val="0284C7"/>
+          <w:sz w:val="25"/>
+        </w:rPr>
+        <w:t>4.2 Stage 2: Bounded Trip Permutation Enumeration with Branch &amp; Bound</w:t>
       </w:r>
     </w:p>
     <w:p>
@@ -810,7 +907,7 @@
           <w:color w:val="1E293B"/>
           <w:sz w:val="22"/>
         </w:rPr>
-        <w:t xml:space="preserve">    P_fair(T) = alpha * max(0, theta_v - mean_theta) + beta * detour(T)</w:t>
+        <w:t>For each driver v and feasible subset of k riders (where 1 ≤ k ≤ capacity C_v ≤ 4), the vehicle must visit 2k + 2 locations: driver origin, k rider pickups, k rider dropoffs, and driver destination (VIT Chennai). Since all commuters share VIT Chennai as the destination, the trip terminates at VIT Chennai.</w:t>
       </w:r>
     </w:p>
     <w:p>
@@ -823,7 +920,43 @@
           <w:color w:val="1E293B"/>
           <w:sz w:val="22"/>
         </w:rPr>
-        <w:t>Disparity across the entire driver cohort is continuously measured via the Gini Coefficient:</w:t>
+        <w:t>There are (2k)! / 2^k valid stop sequences that respect the precedence constraint: for every rider r_i, Pickup(r_i) must precede Dropoff(r_i). FairPool uses a recursive Depth-First Search (DFS) Branch-and-Bound algorithm to explore valid ordering permutations, terminating any branch immediately if cumulative travel time exceeds the driver's detour ceiling or if vehicle occupancy exceeds capacity.</w:t>
+      </w:r>
+    </w:p>
+    <w:p>
+      <w:pPr>
+        <w:spacing w:before="240" w:after="80"/>
+      </w:pPr>
+      <w:r>
+        <w:rPr>
+          <w:rFonts w:ascii="Calibri" w:hAnsi="Calibri"/>
+          <w:b/>
+          <w:color w:val="0284C7"/>
+          <w:sz w:val="25"/>
+        </w:rPr>
+        <w:t>4.3 Stage 3: Multi-Objective Set Packing Assignment</w:t>
+      </w:r>
+    </w:p>
+    <w:p>
+      <w:pPr>
+        <w:spacing w:after="120" w:line="276" w:lineRule="auto"/>
+      </w:pPr>
+      <w:r>
+        <w:rPr>
+          <w:rFonts w:ascii="Calibri" w:hAnsi="Calibri"/>
+          <w:b/>
+          <w:color w:val="1E293B"/>
+          <w:sz w:val="22"/>
+        </w:rPr>
+        <w:t xml:space="preserve">Objective Formulation — </w:t>
+      </w:r>
+      <w:r>
+        <w:rPr>
+          <w:rFonts w:ascii="Calibri" w:hAnsi="Calibri"/>
+          <w:color w:val="1E293B"/>
+          <w:sz w:val="22"/>
+        </w:rPr>
+        <w:t>From all valid candidate trips T across all vehicles, the system selects an optimal subset of non-conflicting trips. Each candidate trip T yields a gross vehicle-kilometer savings S(T) defined as:</w:t>
       </w:r>
     </w:p>
     <w:p>
@@ -836,24 +969,7 @@
           <w:color w:val="1E293B"/>
           <w:sz w:val="22"/>
         </w:rPr>
-        <w:t xml:space="preserve">    G = [ sum_{i=1}^n sum_{j=1}^n |theta_i - theta_j| ] / [ 2 * n * sum_{i=1}^n theta_i ]</w:t>
-        <w:br/>
-        <w:t xml:space="preserve">    (G = 0 represents perfect equity; G = 1 represents total detour concentration onto a single driver).</w:t>
-      </w:r>
-    </w:p>
-    <w:p>
-      <w:pPr>
-        <w:keepNext/>
-        <w:spacing w:before="400" w:after="120"/>
-      </w:pPr>
-      <w:r>
-        <w:rPr>
-          <w:rFonts w:ascii="Arial" w:hAnsi="Arial"/>
-          <w:b/>
-          <w:color w:val="1E3A8A"/>
-          <w:sz w:val="36"/>
-        </w:rPr>
-        <w:t>4. Algorithmic Complexity Analysis</w:t>
+        <w:t>S(T) = [ dist_direct(v) + ∑_{r ∈ T} dist_direct(r) ] - dist_total(T)</w:t>
       </w:r>
     </w:p>
     <w:p>
@@ -866,7 +982,251 @@
           <w:color w:val="1E293B"/>
           <w:sz w:val="22"/>
         </w:rPr>
-        <w:t>Below is the comprehensive time and space complexity breakdown for each stage of the FairPool matching architecture:</w:t>
+        <w:t>To enforce detour equity, each trip is penalized by a dynamic fairness penalty P_fair(T):</w:t>
+      </w:r>
+    </w:p>
+    <w:p>
+      <w:pPr>
+        <w:spacing w:after="120" w:line="276" w:lineRule="auto"/>
+      </w:pPr>
+      <w:r>
+        <w:rPr>
+          <w:rFonts w:ascii="Calibri" w:hAnsi="Calibri"/>
+          <w:color w:val="1E293B"/>
+          <w:sz w:val="22"/>
+        </w:rPr>
+        <w:t>P_fair(T) = α · max(0, θ_v - θ_mean) + β · detour_min(T)</w:t>
+        <w:br/>
+        <w:t>Score(T) = S(T) - λ · P_fair(T)</w:t>
+      </w:r>
+    </w:p>
+    <w:p>
+      <w:pPr>
+        <w:spacing w:after="120" w:line="276" w:lineRule="auto"/>
+      </w:pPr>
+      <w:r>
+        <w:rPr>
+          <w:rFonts w:ascii="Calibri" w:hAnsi="Calibri"/>
+          <w:color w:val="1E293B"/>
+          <w:sz w:val="22"/>
+        </w:rPr>
+        <w:t>The optimal matching is formulated as an Integer Linear Program (Set Packing):</w:t>
+      </w:r>
+    </w:p>
+    <w:p>
+      <w:pPr>
+        <w:spacing w:after="120" w:line="276" w:lineRule="auto"/>
+      </w:pPr>
+      <w:r>
+        <w:rPr>
+          <w:rFonts w:ascii="Calibri" w:hAnsi="Calibri"/>
+          <w:color w:val="1E293B"/>
+          <w:sz w:val="22"/>
+        </w:rPr>
+        <w:t>Maximize:   ∑_{T ∈ T_all} Score(T) · x_T</w:t>
+      </w:r>
+    </w:p>
+    <w:p>
+      <w:pPr>
+        <w:spacing w:after="120" w:line="276" w:lineRule="auto"/>
+      </w:pPr>
+      <w:r>
+        <w:rPr>
+          <w:rFonts w:ascii="Calibri" w:hAnsi="Calibri"/>
+          <w:color w:val="1E293B"/>
+          <w:sz w:val="22"/>
+        </w:rPr>
+        <w:t>Subject to:</w:t>
+      </w:r>
+    </w:p>
+    <w:p>
+      <w:pPr>
+        <w:spacing w:after="120" w:line="276" w:lineRule="auto"/>
+      </w:pPr>
+      <w:r>
+        <w:rPr>
+          <w:rFonts w:ascii="Calibri" w:hAnsi="Calibri"/>
+          <w:color w:val="1E293B"/>
+          <w:sz w:val="22"/>
+        </w:rPr>
+        <w:t xml:space="preserve">  • Rider Exclusivity:      ∑_{T: r ∈ T} x_T ≤ 1,   ∀ r ∈ R   (no rider assigned to multiple vehicles)</w:t>
+      </w:r>
+    </w:p>
+    <w:p>
+      <w:pPr>
+        <w:spacing w:after="120" w:line="276" w:lineRule="auto"/>
+      </w:pPr>
+      <w:r>
+        <w:rPr>
+          <w:rFonts w:ascii="Calibri" w:hAnsi="Calibri"/>
+          <w:color w:val="1E293B"/>
+          <w:sz w:val="22"/>
+        </w:rPr>
+        <w:t xml:space="preserve">  • Vehicle Exclusivity:    ∑_{T: v(T) = v} x_T ≤ 1, ∀ v ∈ V_d (each driver assigned at most one pool)</w:t>
+      </w:r>
+    </w:p>
+    <w:p>
+      <w:pPr>
+        <w:spacing w:after="120" w:line="276" w:lineRule="auto"/>
+      </w:pPr>
+      <w:r>
+        <w:rPr>
+          <w:rFonts w:ascii="Calibri" w:hAnsi="Calibri"/>
+          <w:color w:val="1E293B"/>
+          <w:sz w:val="22"/>
+        </w:rPr>
+        <w:t xml:space="preserve">  • Binary Integrality:     x_T ∈ {0, 1}</w:t>
+      </w:r>
+    </w:p>
+    <w:p>
+      <w:pPr>
+        <w:spacing w:before="240" w:after="80"/>
+      </w:pPr>
+      <w:r>
+        <w:rPr>
+          <w:rFonts w:ascii="Calibri" w:hAnsi="Calibri"/>
+          <w:b/>
+          <w:color w:val="0284C7"/>
+          <w:sz w:val="25"/>
+        </w:rPr>
+        <w:t>4.4 Dual Solver Architecture: Exact ILP vs. High-Speed Greedy</w:t>
+      </w:r>
+    </w:p>
+    <w:p>
+      <w:pPr>
+        <w:spacing w:after="120" w:line="276" w:lineRule="auto"/>
+      </w:pPr>
+      <w:r>
+        <w:rPr>
+          <w:rFonts w:ascii="Calibri" w:hAnsi="Calibri"/>
+          <w:b/>
+          <w:color w:val="1E293B"/>
+          <w:sz w:val="22"/>
+        </w:rPr>
+        <w:t xml:space="preserve">Dual Solvers — </w:t>
+      </w:r>
+      <w:r>
+        <w:rPr>
+          <w:rFonts w:ascii="Calibri" w:hAnsi="Calibri"/>
+          <w:color w:val="1E293B"/>
+          <w:sz w:val="22"/>
+        </w:rPr>
+        <w:t>FairPool provides two swappable set-packing solvers:</w:t>
+      </w:r>
+    </w:p>
+    <w:p>
+      <w:pPr>
+        <w:spacing w:after="120" w:line="276" w:lineRule="auto"/>
+      </w:pPr>
+      <w:r>
+        <w:rPr>
+          <w:rFonts w:ascii="Calibri" w:hAnsi="Calibri"/>
+          <w:color w:val="1E293B"/>
+          <w:sz w:val="22"/>
+        </w:rPr>
+        <w:t>1. Exact MILP Solver: Utilizes branch-and-cut via scipy.optimize.milp to find the mathematically provable global optimum. Ideal for batch benchmarks and offline audits.</w:t>
+      </w:r>
+    </w:p>
+    <w:p>
+      <w:pPr>
+        <w:spacing w:after="120" w:line="276" w:lineRule="auto"/>
+      </w:pPr>
+      <w:r>
+        <w:rPr>
+          <w:rFonts w:ascii="Calibri" w:hAnsi="Calibri"/>
+          <w:color w:val="1E293B"/>
+          <w:sz w:val="22"/>
+        </w:rPr>
+        <w:t>2. High-Speed Greedy Independent Set Solver: Sorts all candidate trips by score density (Score(T) / |T|) in O(|T| log |T|), greedily committing non-overlapping trips. Delivers &gt;96% of the exact solver's savings in under 5 milliseconds, meeting real-time deployment targets.</w:t>
+      </w:r>
+    </w:p>
+    <w:p>
+      <w:pPr>
+        <w:spacing w:before="240" w:after="80"/>
+      </w:pPr>
+      <w:r>
+        <w:rPr>
+          <w:rFonts w:ascii="Calibri" w:hAnsi="Calibri"/>
+          <w:b/>
+          <w:color w:val="0284C7"/>
+          <w:sz w:val="25"/>
+        </w:rPr>
+        <w:t>4.5 Stage 4: Historical Detour Fairness Ledger &amp; Gini Disparity</w:t>
+      </w:r>
+    </w:p>
+    <w:p>
+      <w:pPr>
+        <w:spacing w:after="120" w:line="276" w:lineRule="auto"/>
+      </w:pPr>
+      <w:r>
+        <w:rPr>
+          <w:rFonts w:ascii="Calibri" w:hAnsi="Calibri"/>
+          <w:b/>
+          <w:color w:val="1E293B"/>
+          <w:sz w:val="22"/>
+        </w:rPr>
+        <w:t xml:space="preserve">Gini Disparity — </w:t>
+      </w:r>
+      <w:r>
+        <w:rPr>
+          <w:rFonts w:ascii="Calibri" w:hAnsi="Calibri"/>
+          <w:color w:val="1E293B"/>
+          <w:sz w:val="22"/>
+        </w:rPr>
+        <w:t>Following each solved commute epoch, driver cumulative detours θ_v are updated in a persistent ledger. Dispersion in detour burden across the registered driver cohort is evaluated using the Gini coefficient:</w:t>
+      </w:r>
+    </w:p>
+    <w:p>
+      <w:pPr>
+        <w:spacing w:after="120" w:line="276" w:lineRule="auto"/>
+      </w:pPr>
+      <w:r>
+        <w:rPr>
+          <w:rFonts w:ascii="Calibri" w:hAnsi="Calibri"/>
+          <w:color w:val="1E293B"/>
+          <w:sz w:val="22"/>
+        </w:rPr>
+        <w:t>G = ( ∑_{i=1}^n ∑_{j=1}^n |θ_i - θ_j| ) / ( 2 · n · ∑_{i=1}^n θ_i )</w:t>
+      </w:r>
+    </w:p>
+    <w:p>
+      <w:pPr>
+        <w:spacing w:after="120" w:line="276" w:lineRule="auto"/>
+      </w:pPr>
+      <w:r>
+        <w:rPr>
+          <w:rFonts w:ascii="Calibri" w:hAnsi="Calibri"/>
+          <w:color w:val="1E293B"/>
+          <w:sz w:val="22"/>
+        </w:rPr>
+        <w:t>Drivers with accumulated detour exceeding the cohort mean (θ_v &gt; 1.2 · θ_mean) receive an elevated penalty in subsequent matching cycles, dynamically steering them toward direct solo routes while redistributing carpool detours to rested drivers.</w:t>
+      </w:r>
+    </w:p>
+    <w:p>
+      <w:pPr>
+        <w:spacing w:before="360" w:after="160"/>
+      </w:pPr>
+      <w:r>
+        <w:rPr>
+          <w:rFonts w:ascii="Calibri" w:hAnsi="Calibri"/>
+          <w:b/>
+          <w:color w:val="0B132B"/>
+          <w:sz w:val="32"/>
+        </w:rPr>
+        <w:t>5. Algorithmic Complexity Analysis</w:t>
+      </w:r>
+    </w:p>
+    <w:p>
+      <w:pPr>
+        <w:spacing w:after="120" w:line="276" w:lineRule="auto"/>
+      </w:pPr>
+      <w:r>
+        <w:rPr>
+          <w:rFonts w:ascii="Calibri" w:hAnsi="Calibri"/>
+          <w:color w:val="1E293B"/>
+          <w:sz w:val="22"/>
+        </w:rPr>
+        <w:t>The theoretical computational complexity of each stage in the FairPool architecture is analyzed below:</w:t>
       </w:r>
     </w:p>
     <w:tbl>
@@ -886,7 +1246,7 @@
         <w:tc>
           <w:tcPr>
             <w:tcW w:type="dxa" w:w="1872"/>
-            <w:shd w:fill="1E3A8A"/>
+            <w:shd w:fill="0B132B"/>
             <w:tcMar>
               <w:top w:w="100" w:type="dxa"/>
               <w:bottom w:w="100" w:type="dxa"/>
@@ -897,6 +1257,7 @@
           <w:p>
             <w:r>
               <w:rPr>
+                <w:rFonts w:ascii="Calibri" w:hAnsi="Calibri"/>
                 <w:b/>
                 <w:color w:val="FFFFFF"/>
                 <w:sz w:val="19"/>
@@ -908,7 +1269,7 @@
         <w:tc>
           <w:tcPr>
             <w:tcW w:type="dxa" w:w="1872"/>
-            <w:shd w:fill="1E3A8A"/>
+            <w:shd w:fill="0B132B"/>
             <w:tcMar>
               <w:top w:w="100" w:type="dxa"/>
               <w:bottom w:w="100" w:type="dxa"/>
@@ -919,18 +1280,19 @@
           <w:p>
             <w:r>
               <w:rPr>
+                <w:rFonts w:ascii="Calibri" w:hAnsi="Calibri"/>
                 <w:b/>
                 <w:color w:val="FFFFFF"/>
                 <w:sz w:val="19"/>
               </w:rPr>
-              <w:t>Algorithm / Structure</w:t>
+              <w:t>Algorithm / Paradigm</w:t>
             </w:r>
           </w:p>
         </w:tc>
         <w:tc>
           <w:tcPr>
             <w:tcW w:type="dxa" w:w="1872"/>
-            <w:shd w:fill="1E3A8A"/>
+            <w:shd w:fill="0B132B"/>
             <w:tcMar>
               <w:top w:w="100" w:type="dxa"/>
               <w:bottom w:w="100" w:type="dxa"/>
@@ -941,6 +1303,7 @@
           <w:p>
             <w:r>
               <w:rPr>
+                <w:rFonts w:ascii="Calibri" w:hAnsi="Calibri"/>
                 <w:b/>
                 <w:color w:val="FFFFFF"/>
                 <w:sz w:val="19"/>
@@ -952,7 +1315,7 @@
         <w:tc>
           <w:tcPr>
             <w:tcW w:type="dxa" w:w="1872"/>
-            <w:shd w:fill="1E3A8A"/>
+            <w:shd w:fill="0B132B"/>
             <w:tcMar>
               <w:top w:w="100" w:type="dxa"/>
               <w:bottom w:w="100" w:type="dxa"/>
@@ -963,6 +1326,7 @@
           <w:p>
             <w:r>
               <w:rPr>
+                <w:rFonts w:ascii="Calibri" w:hAnsi="Calibri"/>
                 <w:b/>
                 <w:color w:val="FFFFFF"/>
                 <w:sz w:val="19"/>
@@ -974,7 +1338,7 @@
         <w:tc>
           <w:tcPr>
             <w:tcW w:type="dxa" w:w="1872"/>
-            <w:shd w:fill="1E3A8A"/>
+            <w:shd w:fill="0B132B"/>
             <w:tcMar>
               <w:top w:w="100" w:type="dxa"/>
               <w:bottom w:w="100" w:type="dxa"/>
@@ -985,11 +1349,127 @@
           <w:p>
             <w:r>
               <w:rPr>
+                <w:rFonts w:ascii="Calibri" w:hAnsi="Calibri"/>
                 <w:b/>
                 <w:color w:val="FFFFFF"/>
                 <w:sz w:val="19"/>
               </w:rPr>
-              <w:t>Pruning &amp; Scaling Invariants</w:t>
+              <w:t>Pruning &amp; Practical Speedup</w:t>
+            </w:r>
+          </w:p>
+        </w:tc>
+      </w:tr>
+      <w:tr>
+        <w:tc>
+          <w:tcPr>
+            <w:tcW w:type="dxa" w:w="1872"/>
+            <w:shd w:fill="FFFFFF"/>
+            <w:tcMar>
+              <w:top w:w="80" w:type="dxa"/>
+              <w:bottom w:w="80" w:type="dxa"/>
+              <w:left w:w="80" w:type="dxa"/>
+              <w:right w:w="80" w:type="dxa"/>
+            </w:tcMar>
+          </w:tcPr>
+          <w:p>
+            <w:r>
+              <w:rPr>
+                <w:rFonts w:ascii="Calibri" w:hAnsi="Calibri"/>
+                <w:b/>
+                <w:color w:val="0B132B"/>
+                <w:sz w:val="18"/>
+              </w:rPr>
+              <w:t>Shortest Paths</w:t>
+            </w:r>
+          </w:p>
+        </w:tc>
+        <w:tc>
+          <w:tcPr>
+            <w:tcW w:type="dxa" w:w="1872"/>
+            <w:shd w:fill="FFFFFF"/>
+            <w:tcMar>
+              <w:top w:w="80" w:type="dxa"/>
+              <w:bottom w:w="80" w:type="dxa"/>
+              <w:left w:w="80" w:type="dxa"/>
+              <w:right w:w="80" w:type="dxa"/>
+            </w:tcMar>
+          </w:tcPr>
+          <w:p>
+            <w:r>
+              <w:rPr>
+                <w:rFonts w:ascii="Calibri" w:hAnsi="Calibri"/>
+                <w:color w:val="1E293B"/>
+                <w:sz w:val="18"/>
+              </w:rPr>
+              <w:t>Dijkstra with Min-Heap</w:t>
+            </w:r>
+          </w:p>
+        </w:tc>
+        <w:tc>
+          <w:tcPr>
+            <w:tcW w:type="dxa" w:w="1872"/>
+            <w:shd w:fill="FFFFFF"/>
+            <w:tcMar>
+              <w:top w:w="80" w:type="dxa"/>
+              <w:bottom w:w="80" w:type="dxa"/>
+              <w:left w:w="80" w:type="dxa"/>
+              <w:right w:w="80" w:type="dxa"/>
+            </w:tcMar>
+          </w:tcPr>
+          <w:p>
+            <w:r>
+              <w:rPr>
+                <w:rFonts w:ascii="Calibri" w:hAnsi="Calibri"/>
+                <w:b/>
+                <w:color w:val="0284C7"/>
+                <w:sz w:val="18"/>
+              </w:rPr>
+              <w:t>O((|V| + |E|) log |V|)</w:t>
+            </w:r>
+          </w:p>
+        </w:tc>
+        <w:tc>
+          <w:tcPr>
+            <w:tcW w:type="dxa" w:w="1872"/>
+            <w:shd w:fill="FFFFFF"/>
+            <w:tcMar>
+              <w:top w:w="80" w:type="dxa"/>
+              <w:bottom w:w="80" w:type="dxa"/>
+              <w:left w:w="80" w:type="dxa"/>
+              <w:right w:w="80" w:type="dxa"/>
+            </w:tcMar>
+          </w:tcPr>
+          <w:p>
+            <w:r>
+              <w:rPr>
+                <w:rFonts w:ascii="Calibri" w:hAnsi="Calibri"/>
+                <w:b/>
+                <w:color w:val="0284C7"/>
+                <w:sz w:val="18"/>
+              </w:rPr>
+              <w:t>O(|V| + |E|)</w:t>
+            </w:r>
+          </w:p>
+        </w:tc>
+        <w:tc>
+          <w:tcPr>
+            <w:tcW w:type="dxa" w:w="1872"/>
+            <w:shd w:fill="FFFFFF"/>
+            <w:tcMar>
+              <w:top w:w="80" w:type="dxa"/>
+              <w:bottom w:w="80" w:type="dxa"/>
+              <w:left w:w="80" w:type="dxa"/>
+              <w:right w:w="80" w:type="dxa"/>
+            </w:tcMar>
+          </w:tcPr>
+          <w:p>
+            <w:r>
+              <w:rPr>
+                <w:rFonts w:ascii="Calibri" w:hAnsi="Calibri"/>
+                <w:color w:val="1E293B"/>
+                <w:sz w:val="18"/>
+              </w:rPr>
+              <w:t>Precomputed into dense all-pairs cache matrix D[u, v]; queries are O(1).</w:t>
             </w:r>
           </w:p>
         </w:tc>
@@ -1009,11 +1489,12 @@
           <w:p>
             <w:r>
               <w:rPr>
+                <w:rFonts w:ascii="Calibri" w:hAnsi="Calibri"/>
                 <w:b/>
-                <w:color w:val="1E293B"/>
+                <w:color w:val="0B132B"/>
                 <w:sz w:val="18"/>
               </w:rPr>
-              <w:t>Shortest Paths</w:t>
+              <w:t>Shareability Graph</w:t>
             </w:r>
           </w:p>
         </w:tc>
@@ -1031,10 +1512,11 @@
           <w:p>
             <w:r>
               <w:rPr>
+                <w:rFonts w:ascii="Calibri" w:hAnsi="Calibri"/>
                 <w:color w:val="1E293B"/>
                 <w:sz w:val="18"/>
               </w:rPr>
-              <w:t>Dijkstra with Min-Heap</w:t>
+              <w:t>Pairwise Feasibility Pruning</w:t>
             </w:r>
           </w:p>
         </w:tc>
@@ -1052,10 +1534,12 @@
           <w:p>
             <w:r>
               <w:rPr>
-                <w:color w:val="1E293B"/>
+                <w:rFonts w:ascii="Calibri" w:hAnsi="Calibri"/>
+                <w:b/>
+                <w:color w:val="0284C7"/>
                 <w:sz w:val="18"/>
               </w:rPr>
-              <w:t>O((V + E) log V)</w:t>
+              <w:t>O(|V_d| · |R|²)</w:t>
             </w:r>
           </w:p>
         </w:tc>
@@ -1073,10 +1557,12 @@
           <w:p>
             <w:r>
               <w:rPr>
-                <w:color w:val="1E293B"/>
+                <w:rFonts w:ascii="Calibri" w:hAnsi="Calibri"/>
+                <w:b/>
+                <w:color w:val="0284C7"/>
                 <w:sz w:val="18"/>
               </w:rPr>
-              <w:t>O(V + E)</w:t>
+              <w:t>O(|V_d| · |R|²)</w:t>
             </w:r>
           </w:p>
         </w:tc>
@@ -1094,10 +1580,11 @@
           <w:p>
             <w:r>
               <w:rPr>
+                <w:rFonts w:ascii="Calibri" w:hAnsi="Calibri"/>
                 <w:color w:val="1E293B"/>
                 <w:sz w:val="18"/>
               </w:rPr>
-              <w:t>Precomputed all-pairs cache matrix for instant O(1) table lookup</w:t>
+              <w:t>Bounded departure time windows and detour thresholds eliminate &gt;85% pairs.</w:t>
             </w:r>
           </w:p>
         </w:tc>
@@ -1117,11 +1604,12 @@
           <w:p>
             <w:r>
               <w:rPr>
+                <w:rFonts w:ascii="Calibri" w:hAnsi="Calibri"/>
                 <w:b/>
-                <w:color w:val="1E293B"/>
+                <w:color w:val="0B132B"/>
                 <w:sz w:val="18"/>
               </w:rPr>
-              <w:t>Shareability Graph</w:t>
+              <w:t>Trip Enumeration</w:t>
             </w:r>
           </w:p>
         </w:tc>
@@ -1139,10 +1627,11 @@
           <w:p>
             <w:r>
               <w:rPr>
+                <w:rFonts w:ascii="Calibri" w:hAnsi="Calibri"/>
                 <w:color w:val="1E293B"/>
                 <w:sz w:val="18"/>
               </w:rPr>
-              <w:t>Spatial-Temporal Pruner</w:t>
+              <w:t>Branch &amp; Bound DFS</w:t>
             </w:r>
           </w:p>
         </w:tc>
@@ -1160,10 +1649,12 @@
           <w:p>
             <w:r>
               <w:rPr>
-                <w:color w:val="1E293B"/>
+                <w:rFonts w:ascii="Calibri" w:hAnsi="Calibri"/>
+                <w:b/>
+                <w:color w:val="0284C7"/>
                 <w:sz w:val="18"/>
               </w:rPr>
-              <w:t>O(|V| * |R|^2)</w:t>
+              <w:t>O(|V_d| · (K choose C) · (2C)! / 2^C)</w:t>
             </w:r>
           </w:p>
         </w:tc>
@@ -1181,10 +1672,12 @@
           <w:p>
             <w:r>
               <w:rPr>
-                <w:color w:val="1E293B"/>
+                <w:rFonts w:ascii="Calibri" w:hAnsi="Calibri"/>
+                <w:b/>
+                <w:color w:val="0284C7"/>
                 <w:sz w:val="18"/>
               </w:rPr>
-              <w:t>O(|V| * |R|^2)</w:t>
+              <w:t>O(|T|)</w:t>
             </w:r>
           </w:p>
         </w:tc>
@@ -1202,10 +1695,11 @@
           <w:p>
             <w:r>
               <w:rPr>
+                <w:rFonts w:ascii="Calibri" w:hAnsi="Calibri"/>
                 <w:color w:val="1E293B"/>
                 <w:sz w:val="18"/>
               </w:rPr>
-              <w:t>Quadratic in requests; pruned via coordinate bounding boxes and time windows</w:t>
+              <w:t>C ≤ 4 seats; top-K candidate filtering (K ≤ 10); early cutoff on detour excess.</w:t>
             </w:r>
           </w:p>
         </w:tc>
@@ -1225,11 +1719,12 @@
           <w:p>
             <w:r>
               <w:rPr>
+                <w:rFonts w:ascii="Calibri" w:hAnsi="Calibri"/>
                 <w:b/>
-                <w:color w:val="1E293B"/>
+                <w:color w:val="0B132B"/>
                 <w:sz w:val="18"/>
               </w:rPr>
-              <w:t>Trip Enumeration</w:t>
+              <w:t>Exact Solver (MILP)</w:t>
             </w:r>
           </w:p>
         </w:tc>
@@ -1247,10 +1742,11 @@
           <w:p>
             <w:r>
               <w:rPr>
+                <w:rFonts w:ascii="Calibri" w:hAnsi="Calibri"/>
                 <w:color w:val="1E293B"/>
                 <w:sz w:val="18"/>
               </w:rPr>
-              <w:t>Branch-and-Bound DFS</w:t>
+              <w:t>Branch-and-Cut (HiGHS)</w:t>
             </w:r>
           </w:p>
         </w:tc>
@@ -1268,10 +1764,12 @@
           <w:p>
             <w:r>
               <w:rPr>
-                <w:color w:val="1E293B"/>
+                <w:rFonts w:ascii="Calibri" w:hAnsi="Calibri"/>
+                <w:b/>
+                <w:color w:val="0284C7"/>
                 <w:sz w:val="18"/>
               </w:rPr>
-              <w:t>O(|V| * (K choose C) * (2C)! / 2^C)</w:t>
+              <w:t>Worst-case O(2^|T|)</w:t>
             </w:r>
           </w:p>
         </w:tc>
@@ -1289,10 +1787,12 @@
           <w:p>
             <w:r>
               <w:rPr>
-                <w:color w:val="1E293B"/>
+                <w:rFonts w:ascii="Calibri" w:hAnsi="Calibri"/>
+                <w:b/>
+                <w:color w:val="0284C7"/>
                 <w:sz w:val="18"/>
               </w:rPr>
-              <w:t>O(|T|)</w:t>
+              <w:t>O(|R| · |T|)</w:t>
             </w:r>
           </w:p>
         </w:tc>
@@ -1310,10 +1810,11 @@
           <w:p>
             <w:r>
               <w:rPr>
+                <w:rFonts w:ascii="Calibri" w:hAnsi="Calibri"/>
                 <w:color w:val="1E293B"/>
                 <w:sz w:val="18"/>
               </w:rPr>
-              <w:t>Top-K proximity filtering (K &lt;= 10) &amp; precedence pruning; C &lt;= 3 seats</w:t>
+              <w:t>Strict constraint matrix sparse formulation; solves typical batches in &lt;250 ms.</w:t>
             </w:r>
           </w:p>
         </w:tc>
@@ -1333,11 +1834,12 @@
           <w:p>
             <w:r>
               <w:rPr>
+                <w:rFonts w:ascii="Calibri" w:hAnsi="Calibri"/>
                 <w:b/>
-                <w:color w:val="1E293B"/>
+                <w:color w:val="0B132B"/>
                 <w:sz w:val="18"/>
               </w:rPr>
-              <w:t>Exact Solver</w:t>
+              <w:t>Greedy Solver</w:t>
             </w:r>
           </w:p>
         </w:tc>
@@ -1355,10 +1857,11 @@
           <w:p>
             <w:r>
               <w:rPr>
+                <w:rFonts w:ascii="Calibri" w:hAnsi="Calibri"/>
                 <w:color w:val="1E293B"/>
                 <w:sz w:val="18"/>
               </w:rPr>
-              <w:t>MILP Branch-and-Cut</w:t>
+              <w:t>Max-Weight Independent Set</w:t>
             </w:r>
           </w:p>
         </w:tc>
@@ -1376,10 +1879,12 @@
           <w:p>
             <w:r>
               <w:rPr>
-                <w:color w:val="1E293B"/>
+                <w:rFonts w:ascii="Calibri" w:hAnsi="Calibri"/>
+                <w:b/>
+                <w:color w:val="0284C7"/>
                 <w:sz w:val="18"/>
               </w:rPr>
-              <w:t>O(2^|T|) worst-case</w:t>
+              <w:t>O(|T| log |T|)</w:t>
             </w:r>
           </w:p>
         </w:tc>
@@ -1397,10 +1902,12 @@
           <w:p>
             <w:r>
               <w:rPr>
-                <w:color w:val="1E293B"/>
+                <w:rFonts w:ascii="Calibri" w:hAnsi="Calibri"/>
+                <w:b/>
+                <w:color w:val="0284C7"/>
                 <w:sz w:val="18"/>
               </w:rPr>
-              <w:t>O(|R| * |T|)</w:t>
+              <w:t>O(|T|)</w:t>
             </w:r>
           </w:p>
         </w:tc>
@@ -1418,10 +1925,11 @@
           <w:p>
             <w:r>
               <w:rPr>
+                <w:rFonts w:ascii="Calibri" w:hAnsi="Calibri"/>
                 <w:color w:val="1E293B"/>
                 <w:sz w:val="18"/>
               </w:rPr>
-              <w:t>Fast branch-and-cut via HiGHS solver in scipy.optimize.milp</w:t>
+              <w:t>Score-density sorting; completes in &lt;5 ms on 200+ requests for real-time APIs.</w:t>
             </w:r>
           </w:p>
         </w:tc>
@@ -1441,11 +1949,12 @@
           <w:p>
             <w:r>
               <w:rPr>
+                <w:rFonts w:ascii="Calibri" w:hAnsi="Calibri"/>
                 <w:b/>
-                <w:color w:val="1E293B"/>
+                <w:color w:val="0B132B"/>
                 <w:sz w:val="18"/>
               </w:rPr>
-              <w:t>Approx. Solver</w:t>
+              <w:t>Fairness Ledger</w:t>
             </w:r>
           </w:p>
         </w:tc>
@@ -1463,10 +1972,11 @@
           <w:p>
             <w:r>
               <w:rPr>
+                <w:rFonts w:ascii="Calibri" w:hAnsi="Calibri"/>
                 <w:color w:val="1E293B"/>
                 <w:sz w:val="18"/>
               </w:rPr>
-              <w:t>Weight-Density Greedy</w:t>
+              <w:t>Cumulative Quantile Sort</w:t>
             </w:r>
           </w:p>
         </w:tc>
@@ -1484,10 +1994,12 @@
           <w:p>
             <w:r>
               <w:rPr>
-                <w:color w:val="1E293B"/>
+                <w:rFonts w:ascii="Calibri" w:hAnsi="Calibri"/>
+                <w:b/>
+                <w:color w:val="0284C7"/>
                 <w:sz w:val="18"/>
               </w:rPr>
-              <w:t>O(|T| log |T|)</w:t>
+              <w:t>O(|V_d| log |V_d|)</w:t>
             </w:r>
           </w:p>
         </w:tc>
@@ -1505,10 +2017,12 @@
           <w:p>
             <w:r>
               <w:rPr>
-                <w:color w:val="1E293B"/>
+                <w:rFonts w:ascii="Calibri" w:hAnsi="Calibri"/>
+                <w:b/>
+                <w:color w:val="0284C7"/>
                 <w:sz w:val="18"/>
               </w:rPr>
-              <w:t>O(|T|)</w:t>
+              <w:t>O(|V_d|)</w:t>
             </w:r>
           </w:p>
         </w:tc>
@@ -1526,118 +2040,11 @@
           <w:p>
             <w:r>
               <w:rPr>
+                <w:rFonts w:ascii="Calibri" w:hAnsi="Calibri"/>
                 <w:color w:val="1E293B"/>
                 <w:sz w:val="18"/>
               </w:rPr>
-              <w:t>Sorts candidates by net efficiency density; solves 200+ requests in &lt;5 ms</w:t>
-            </w:r>
-          </w:p>
-        </w:tc>
-      </w:tr>
-      <w:tr>
-        <w:tc>
-          <w:tcPr>
-            <w:tcW w:type="dxa" w:w="1872"/>
-            <w:shd w:fill="FFFFFF"/>
-            <w:tcMar>
-              <w:top w:w="80" w:type="dxa"/>
-              <w:bottom w:w="80" w:type="dxa"/>
-              <w:left w:w="80" w:type="dxa"/>
-              <w:right w:w="80" w:type="dxa"/>
-            </w:tcMar>
-          </w:tcPr>
-          <w:p>
-            <w:r>
-              <w:rPr>
-                <w:b/>
-                <w:color w:val="1E293B"/>
-                <w:sz w:val="18"/>
-              </w:rPr>
-              <w:t>Fairness Ledger</w:t>
-            </w:r>
-          </w:p>
-        </w:tc>
-        <w:tc>
-          <w:tcPr>
-            <w:tcW w:type="dxa" w:w="1872"/>
-            <w:shd w:fill="FFFFFF"/>
-            <w:tcMar>
-              <w:top w:w="80" w:type="dxa"/>
-              <w:bottom w:w="80" w:type="dxa"/>
-              <w:left w:w="80" w:type="dxa"/>
-              <w:right w:w="80" w:type="dxa"/>
-            </w:tcMar>
-          </w:tcPr>
-          <w:p>
-            <w:r>
-              <w:rPr>
-                <w:color w:val="1E293B"/>
-                <w:sz w:val="18"/>
-              </w:rPr>
-              <w:t>Ordered Quantile Gini</w:t>
-            </w:r>
-          </w:p>
-        </w:tc>
-        <w:tc>
-          <w:tcPr>
-            <w:tcW w:type="dxa" w:w="1872"/>
-            <w:shd w:fill="FFFFFF"/>
-            <w:tcMar>
-              <w:top w:w="80" w:type="dxa"/>
-              <w:bottom w:w="80" w:type="dxa"/>
-              <w:left w:w="80" w:type="dxa"/>
-              <w:right w:w="80" w:type="dxa"/>
-            </w:tcMar>
-          </w:tcPr>
-          <w:p>
-            <w:r>
-              <w:rPr>
-                <w:color w:val="1E293B"/>
-                <w:sz w:val="18"/>
-              </w:rPr>
-              <w:t>O(|V| log |V|)</w:t>
-            </w:r>
-          </w:p>
-        </w:tc>
-        <w:tc>
-          <w:tcPr>
-            <w:tcW w:type="dxa" w:w="1872"/>
-            <w:shd w:fill="FFFFFF"/>
-            <w:tcMar>
-              <w:top w:w="80" w:type="dxa"/>
-              <w:bottom w:w="80" w:type="dxa"/>
-              <w:left w:w="80" w:type="dxa"/>
-              <w:right w:w="80" w:type="dxa"/>
-            </w:tcMar>
-          </w:tcPr>
-          <w:p>
-            <w:r>
-              <w:rPr>
-                <w:color w:val="1E293B"/>
-                <w:sz w:val="18"/>
-              </w:rPr>
-              <w:t>O(|V|)</w:t>
-            </w:r>
-          </w:p>
-        </w:tc>
-        <w:tc>
-          <w:tcPr>
-            <w:tcW w:type="dxa" w:w="1872"/>
-            <w:shd w:fill="FFFFFF"/>
-            <w:tcMar>
-              <w:top w:w="80" w:type="dxa"/>
-              <w:bottom w:w="80" w:type="dxa"/>
-              <w:left w:w="80" w:type="dxa"/>
-              <w:right w:w="80" w:type="dxa"/>
-            </w:tcMar>
-          </w:tcPr>
-          <w:p>
-            <w:r>
-              <w:rPr>
-                <w:color w:val="1E293B"/>
-                <w:sz w:val="18"/>
-              </w:rPr>
-              <w:t>Rolling historical ledger updated across batch epochs in linear time</w:t>
+              <w:t>Maintains historical detour ledger across rolling morning commute epochs.</w:t>
             </w:r>
           </w:p>
         </w:tc>
@@ -1645,22 +2052,21 @@
     </w:tbl>
     <w:p>
       <w:pPr>
-        <w:spacing w:after="120"/>
+        <w:spacing w:after="160"/>
       </w:pPr>
     </w:p>
     <w:p>
       <w:pPr>
-        <w:keepNext/>
-        <w:spacing w:before="400" w:after="120"/>
+        <w:spacing w:before="360" w:after="160"/>
       </w:pPr>
       <w:r>
         <w:rPr>
-          <w:rFonts w:ascii="Arial" w:hAnsi="Arial"/>
+          <w:rFonts w:ascii="Calibri" w:hAnsi="Calibri"/>
           <w:b/>
-          <w:color w:val="1E3A8A"/>
-          <w:sz w:val="36"/>
+          <w:color w:val="0B132B"/>
+          <w:sz w:val="32"/>
         </w:rPr>
-        <w:t>5. Empirical Benchmark Evaluation</w:t>
+        <w:t>6. Experimental Evaluation &amp; Scientific Benchmarks</w:t>
       </w:r>
     </w:p>
     <w:p>
@@ -1673,7 +2079,7 @@
           <w:color w:val="1E293B"/>
           <w:sz w:val="22"/>
         </w:rPr>
-        <w:t>To validate FairPool's algorithmic superiority, we evaluated the system using a deterministic benchmark harness configured with fixed random seeds (seed=42) on realistic metropolitan Chennai morning commute cohorts (30 commuter requests, 12 driver offers).</w:t>
+        <w:t>To rigorously quantify performance, FairPool was evaluated against standard transportation baselines on a reproducible morning rush commuter dataset of 30 rider requests and 12 driver offers converging on VIT Chennai (fixed seed = 42).</w:t>
       </w:r>
     </w:p>
     <w:tbl>
@@ -1696,7 +2102,7 @@
         <w:tc>
           <w:tcPr>
             <w:tcW w:type="dxa" w:w="1170"/>
-            <w:shd w:fill="1E3A8A"/>
+            <w:shd w:fill="0B132B"/>
             <w:tcMar>
               <w:top w:w="100" w:type="dxa"/>
               <w:bottom w:w="100" w:type="dxa"/>
@@ -1707,9 +2113,10 @@
           <w:p>
             <w:r>
               <w:rPr>
+                <w:rFonts w:ascii="Calibri" w:hAnsi="Calibri"/>
                 <w:b/>
                 <w:color w:val="FFFFFF"/>
-                <w:sz w:val="19"/>
+                <w:sz w:val="18"/>
               </w:rPr>
               <w:t>Algorithm</w:t>
             </w:r>
@@ -1718,7 +2125,7 @@
         <w:tc>
           <w:tcPr>
             <w:tcW w:type="dxa" w:w="1170"/>
-            <w:shd w:fill="1E3A8A"/>
+            <w:shd w:fill="0B132B"/>
             <w:tcMar>
               <w:top w:w="100" w:type="dxa"/>
               <w:bottom w:w="100" w:type="dxa"/>
@@ -1729,9 +2136,10 @@
           <w:p>
             <w:r>
               <w:rPr>
+                <w:rFonts w:ascii="Calibri" w:hAnsi="Calibri"/>
                 <w:b/>
                 <w:color w:val="FFFFFF"/>
-                <w:sz w:val="19"/>
+                <w:sz w:val="18"/>
               </w:rPr>
               <w:t>Matched Trips</w:t>
             </w:r>
@@ -1740,7 +2148,7 @@
         <w:tc>
           <w:tcPr>
             <w:tcW w:type="dxa" w:w="1170"/>
-            <w:shd w:fill="1E3A8A"/>
+            <w:shd w:fill="0B132B"/>
             <w:tcMar>
               <w:top w:w="100" w:type="dxa"/>
               <w:bottom w:w="100" w:type="dxa"/>
@@ -1751,9 +2159,10 @@
           <w:p>
             <w:r>
               <w:rPr>
+                <w:rFonts w:ascii="Calibri" w:hAnsi="Calibri"/>
                 <w:b/>
                 <w:color w:val="FFFFFF"/>
-                <w:sz w:val="19"/>
+                <w:sz w:val="18"/>
               </w:rPr>
               <w:t>Match %</w:t>
             </w:r>
@@ -1762,7 +2171,7 @@
         <w:tc>
           <w:tcPr>
             <w:tcW w:type="dxa" w:w="1170"/>
-            <w:shd w:fill="1E3A8A"/>
+            <w:shd w:fill="0B132B"/>
             <w:tcMar>
               <w:top w:w="100" w:type="dxa"/>
               <w:bottom w:w="100" w:type="dxa"/>
@@ -1773,9 +2182,10 @@
           <w:p>
             <w:r>
               <w:rPr>
+                <w:rFonts w:ascii="Calibri" w:hAnsi="Calibri"/>
                 <w:b/>
                 <w:color w:val="FFFFFF"/>
-                <w:sz w:val="19"/>
+                <w:sz w:val="18"/>
               </w:rPr>
               <w:t>VKM Saved</w:t>
             </w:r>
@@ -1784,7 +2194,7 @@
         <w:tc>
           <w:tcPr>
             <w:tcW w:type="dxa" w:w="1170"/>
-            <w:shd w:fill="1E3A8A"/>
+            <w:shd w:fill="0B132B"/>
             <w:tcMar>
               <w:top w:w="100" w:type="dxa"/>
               <w:bottom w:w="100" w:type="dxa"/>
@@ -1795,18 +2205,19 @@
           <w:p>
             <w:r>
               <w:rPr>
+                <w:rFonts w:ascii="Calibri" w:hAnsi="Calibri"/>
                 <w:b/>
                 <w:color w:val="FFFFFF"/>
-                <w:sz w:val="19"/>
+                <w:sz w:val="18"/>
               </w:rPr>
-              <w:t>VKM %</w:t>
+              <w:t>Savings %</w:t>
             </w:r>
           </w:p>
         </w:tc>
         <w:tc>
           <w:tcPr>
             <w:tcW w:type="dxa" w:w="1170"/>
-            <w:shd w:fill="1E3A8A"/>
+            <w:shd w:fill="0B132B"/>
             <w:tcMar>
               <w:top w:w="100" w:type="dxa"/>
               <w:bottom w:w="100" w:type="dxa"/>
@@ -1817,9 +2228,10 @@
           <w:p>
             <w:r>
               <w:rPr>
+                <w:rFonts w:ascii="Calibri" w:hAnsi="Calibri"/>
                 <w:b/>
                 <w:color w:val="FFFFFF"/>
-                <w:sz w:val="19"/>
+                <w:sz w:val="18"/>
               </w:rPr>
               <w:t>Mean Detour</w:t>
             </w:r>
@@ -1828,7 +2240,7 @@
         <w:tc>
           <w:tcPr>
             <w:tcW w:type="dxa" w:w="1170"/>
-            <w:shd w:fill="1E3A8A"/>
+            <w:shd w:fill="0B132B"/>
             <w:tcMar>
               <w:top w:w="100" w:type="dxa"/>
               <w:bottom w:w="100" w:type="dxa"/>
@@ -1839,18 +2251,19 @@
           <w:p>
             <w:r>
               <w:rPr>
+                <w:rFonts w:ascii="Calibri" w:hAnsi="Calibri"/>
                 <w:b/>
                 <w:color w:val="FFFFFF"/>
-                <w:sz w:val="19"/>
+                <w:sz w:val="18"/>
               </w:rPr>
-              <w:t>Gini</w:t>
+              <w:t>Gini Disparity</w:t>
             </w:r>
           </w:p>
         </w:tc>
         <w:tc>
           <w:tcPr>
             <w:tcW w:type="dxa" w:w="1170"/>
-            <w:shd w:fill="1E3A8A"/>
+            <w:shd w:fill="0B132B"/>
             <w:tcMar>
               <w:top w:w="100" w:type="dxa"/>
               <w:bottom w:w="100" w:type="dxa"/>
@@ -1861,11 +2274,190 @@
           <w:p>
             <w:r>
               <w:rPr>
+                <w:rFonts w:ascii="Calibri" w:hAnsi="Calibri"/>
                 <w:b/>
                 <w:color w:val="FFFFFF"/>
-                <w:sz w:val="19"/>
+                <w:sz w:val="18"/>
               </w:rPr>
               <w:t>Runtime</w:t>
+            </w:r>
+          </w:p>
+        </w:tc>
+      </w:tr>
+      <w:tr>
+        <w:tc>
+          <w:tcPr>
+            <w:tcW w:type="dxa" w:w="1170"/>
+            <w:shd w:fill="FFFFFF"/>
+            <w:tcMar>
+              <w:top w:w="80" w:type="dxa"/>
+              <w:bottom w:w="80" w:type="dxa"/>
+              <w:left w:w="80" w:type="dxa"/>
+              <w:right w:w="80" w:type="dxa"/>
+            </w:tcMar>
+          </w:tcPr>
+          <w:p>
+            <w:r>
+              <w:rPr>
+                <w:rFonts w:ascii="Calibri" w:hAnsi="Calibri"/>
+                <w:color w:val="1E293B"/>
+                <w:sz w:val="18"/>
+              </w:rPr>
+              <w:t>No-Pooling Baseline</w:t>
+            </w:r>
+          </w:p>
+        </w:tc>
+        <w:tc>
+          <w:tcPr>
+            <w:tcW w:type="dxa" w:w="1170"/>
+            <w:shd w:fill="FFFFFF"/>
+            <w:tcMar>
+              <w:top w:w="80" w:type="dxa"/>
+              <w:bottom w:w="80" w:type="dxa"/>
+              <w:left w:w="80" w:type="dxa"/>
+              <w:right w:w="80" w:type="dxa"/>
+            </w:tcMar>
+          </w:tcPr>
+          <w:p>
+            <w:r>
+              <w:rPr>
+                <w:rFonts w:ascii="Calibri" w:hAnsi="Calibri"/>
+                <w:color w:val="1E293B"/>
+                <w:sz w:val="18"/>
+              </w:rPr>
+              <w:t>0</w:t>
+            </w:r>
+          </w:p>
+        </w:tc>
+        <w:tc>
+          <w:tcPr>
+            <w:tcW w:type="dxa" w:w="1170"/>
+            <w:shd w:fill="FFFFFF"/>
+            <w:tcMar>
+              <w:top w:w="80" w:type="dxa"/>
+              <w:bottom w:w="80" w:type="dxa"/>
+              <w:left w:w="80" w:type="dxa"/>
+              <w:right w:w="80" w:type="dxa"/>
+            </w:tcMar>
+          </w:tcPr>
+          <w:p>
+            <w:r>
+              <w:rPr>
+                <w:rFonts w:ascii="Calibri" w:hAnsi="Calibri"/>
+                <w:color w:val="1E293B"/>
+                <w:sz w:val="18"/>
+              </w:rPr>
+              <w:t>0.0%</w:t>
+            </w:r>
+          </w:p>
+        </w:tc>
+        <w:tc>
+          <w:tcPr>
+            <w:tcW w:type="dxa" w:w="1170"/>
+            <w:shd w:fill="FFFFFF"/>
+            <w:tcMar>
+              <w:top w:w="80" w:type="dxa"/>
+              <w:bottom w:w="80" w:type="dxa"/>
+              <w:left w:w="80" w:type="dxa"/>
+              <w:right w:w="80" w:type="dxa"/>
+            </w:tcMar>
+          </w:tcPr>
+          <w:p>
+            <w:r>
+              <w:rPr>
+                <w:rFonts w:ascii="Calibri" w:hAnsi="Calibri"/>
+                <w:color w:val="1E293B"/>
+                <w:sz w:val="18"/>
+              </w:rPr>
+              <w:t>0.0 km</w:t>
+            </w:r>
+          </w:p>
+        </w:tc>
+        <w:tc>
+          <w:tcPr>
+            <w:tcW w:type="dxa" w:w="1170"/>
+            <w:shd w:fill="FFFFFF"/>
+            <w:tcMar>
+              <w:top w:w="80" w:type="dxa"/>
+              <w:bottom w:w="80" w:type="dxa"/>
+              <w:left w:w="80" w:type="dxa"/>
+              <w:right w:w="80" w:type="dxa"/>
+            </w:tcMar>
+          </w:tcPr>
+          <w:p>
+            <w:r>
+              <w:rPr>
+                <w:rFonts w:ascii="Calibri" w:hAnsi="Calibri"/>
+                <w:color w:val="1E293B"/>
+                <w:sz w:val="18"/>
+              </w:rPr>
+              <w:t>0.0%</w:t>
+            </w:r>
+          </w:p>
+        </w:tc>
+        <w:tc>
+          <w:tcPr>
+            <w:tcW w:type="dxa" w:w="1170"/>
+            <w:shd w:fill="FFFFFF"/>
+            <w:tcMar>
+              <w:top w:w="80" w:type="dxa"/>
+              <w:bottom w:w="80" w:type="dxa"/>
+              <w:left w:w="80" w:type="dxa"/>
+              <w:right w:w="80" w:type="dxa"/>
+            </w:tcMar>
+          </w:tcPr>
+          <w:p>
+            <w:r>
+              <w:rPr>
+                <w:rFonts w:ascii="Calibri" w:hAnsi="Calibri"/>
+                <w:color w:val="1E293B"/>
+                <w:sz w:val="18"/>
+              </w:rPr>
+              <w:t>0.0 min</w:t>
+            </w:r>
+          </w:p>
+        </w:tc>
+        <w:tc>
+          <w:tcPr>
+            <w:tcW w:type="dxa" w:w="1170"/>
+            <w:shd w:fill="FFFFFF"/>
+            <w:tcMar>
+              <w:top w:w="80" w:type="dxa"/>
+              <w:bottom w:w="80" w:type="dxa"/>
+              <w:left w:w="80" w:type="dxa"/>
+              <w:right w:w="80" w:type="dxa"/>
+            </w:tcMar>
+          </w:tcPr>
+          <w:p>
+            <w:r>
+              <w:rPr>
+                <w:rFonts w:ascii="Calibri" w:hAnsi="Calibri"/>
+                <w:color w:val="1E293B"/>
+                <w:sz w:val="18"/>
+              </w:rPr>
+              <w:t>0.0000</w:t>
+            </w:r>
+          </w:p>
+        </w:tc>
+        <w:tc>
+          <w:tcPr>
+            <w:tcW w:type="dxa" w:w="1170"/>
+            <w:shd w:fill="FFFFFF"/>
+            <w:tcMar>
+              <w:top w:w="80" w:type="dxa"/>
+              <w:bottom w:w="80" w:type="dxa"/>
+              <w:left w:w="80" w:type="dxa"/>
+              <w:right w:w="80" w:type="dxa"/>
+            </w:tcMar>
+          </w:tcPr>
+          <w:p>
+            <w:r>
+              <w:rPr>
+                <w:rFonts w:ascii="Calibri" w:hAnsi="Calibri"/>
+                <w:color w:val="1E293B"/>
+                <w:sz w:val="18"/>
+              </w:rPr>
+              <w:t>0.02 ms</w:t>
             </w:r>
           </w:p>
         </w:tc>
@@ -1885,11 +2477,11 @@
           <w:p>
             <w:r>
               <w:rPr>
-                <w:b/>
+                <w:rFonts w:ascii="Calibri" w:hAnsi="Calibri"/>
                 <w:color w:val="1E293B"/>
                 <w:sz w:val="18"/>
               </w:rPr>
-              <w:t>No-Pooling Solo Baseline</w:t>
+              <w:t>Greedy Nearest-Pair</w:t>
             </w:r>
           </w:p>
         </w:tc>
@@ -1907,10 +2499,11 @@
           <w:p>
             <w:r>
               <w:rPr>
+                <w:rFonts w:ascii="Calibri" w:hAnsi="Calibri"/>
                 <w:color w:val="1E293B"/>
                 <w:sz w:val="18"/>
               </w:rPr>
-              <w:t>0</w:t>
+              <w:t>12</w:t>
             </w:r>
           </w:p>
         </w:tc>
@@ -1928,10 +2521,11 @@
           <w:p>
             <w:r>
               <w:rPr>
+                <w:rFonts w:ascii="Calibri" w:hAnsi="Calibri"/>
                 <w:color w:val="1E293B"/>
                 <w:sz w:val="18"/>
               </w:rPr>
-              <w:t>0.0%</w:t>
+              <w:t>40.0%</w:t>
             </w:r>
           </w:p>
         </w:tc>
@@ -1949,10 +2543,11 @@
           <w:p>
             <w:r>
               <w:rPr>
+                <w:rFonts w:ascii="Calibri" w:hAnsi="Calibri"/>
                 <w:color w:val="1E293B"/>
                 <w:sz w:val="18"/>
               </w:rPr>
-              <w:t>0.0 km</w:t>
+              <w:t>19.0 km</w:t>
             </w:r>
           </w:p>
         </w:tc>
@@ -1970,11 +2565,11 @@
           <w:p>
             <w:r>
               <w:rPr>
-                <w:b/>
+                <w:rFonts w:ascii="Calibri" w:hAnsi="Calibri"/>
                 <w:color w:val="1E293B"/>
                 <w:sz w:val="18"/>
               </w:rPr>
-              <w:t>0.0%</w:t>
+              <w:t>16.7%</w:t>
             </w:r>
           </w:p>
         </w:tc>
@@ -1992,10 +2587,11 @@
           <w:p>
             <w:r>
               <w:rPr>
+                <w:rFonts w:ascii="Calibri" w:hAnsi="Calibri"/>
                 <w:color w:val="1E293B"/>
                 <w:sz w:val="18"/>
               </w:rPr>
-              <w:t>0.0 min</w:t>
+              <w:t>1.5 min</w:t>
             </w:r>
           </w:p>
         </w:tc>
@@ -2013,11 +2609,11 @@
           <w:p>
             <w:r>
               <w:rPr>
-                <w:b/>
+                <w:rFonts w:ascii="Calibri" w:hAnsi="Calibri"/>
                 <w:color w:val="1E293B"/>
                 <w:sz w:val="18"/>
               </w:rPr>
-              <w:t>0.0000</w:t>
+              <w:t>0.5707</w:t>
             </w:r>
           </w:p>
         </w:tc>
@@ -2035,10 +2631,11 @@
           <w:p>
             <w:r>
               <w:rPr>
+                <w:rFonts w:ascii="Calibri" w:hAnsi="Calibri"/>
                 <w:color w:val="1E293B"/>
                 <w:sz w:val="18"/>
               </w:rPr>
-              <w:t>0.02 ms</w:t>
+              <w:t>0.67 ms</w:t>
             </w:r>
           </w:p>
         </w:tc>
@@ -2058,11 +2655,11 @@
           <w:p>
             <w:r>
               <w:rPr>
-                <w:b/>
+                <w:rFonts w:ascii="Calibri" w:hAnsi="Calibri"/>
                 <w:color w:val="1E293B"/>
                 <w:sz w:val="18"/>
               </w:rPr>
-              <w:t>Greedy Nearest-Pair</w:t>
+              <w:t>FairPool [Ablation: No Fairness]</w:t>
             </w:r>
           </w:p>
         </w:tc>
@@ -2080,6 +2677,7 @@
           <w:p>
             <w:r>
               <w:rPr>
+                <w:rFonts w:ascii="Calibri" w:hAnsi="Calibri"/>
                 <w:color w:val="1E293B"/>
                 <w:sz w:val="18"/>
               </w:rPr>
@@ -2101,10 +2699,11 @@
           <w:p>
             <w:r>
               <w:rPr>
+                <w:rFonts w:ascii="Calibri" w:hAnsi="Calibri"/>
                 <w:color w:val="1E293B"/>
                 <w:sz w:val="18"/>
               </w:rPr>
-              <w:t>40.0%</w:t>
+              <w:t>60.0%</w:t>
             </w:r>
           </w:p>
         </w:tc>
@@ -2122,10 +2721,11 @@
           <w:p>
             <w:r>
               <w:rPr>
+                <w:rFonts w:ascii="Calibri" w:hAnsi="Calibri"/>
                 <w:color w:val="1E293B"/>
                 <w:sz w:val="18"/>
               </w:rPr>
-              <w:t>19.0 km</w:t>
+              <w:t>39.6 km</w:t>
             </w:r>
           </w:p>
         </w:tc>
@@ -2143,11 +2743,11 @@
           <w:p>
             <w:r>
               <w:rPr>
-                <w:b/>
+                <w:rFonts w:ascii="Calibri" w:hAnsi="Calibri"/>
                 <w:color w:val="1E293B"/>
                 <w:sz w:val="18"/>
               </w:rPr>
-              <w:t>16.7%</w:t>
+              <w:t>34.8%</w:t>
             </w:r>
           </w:p>
         </w:tc>
@@ -2165,10 +2765,11 @@
           <w:p>
             <w:r>
               <w:rPr>
+                <w:rFonts w:ascii="Calibri" w:hAnsi="Calibri"/>
                 <w:color w:val="1E293B"/>
                 <w:sz w:val="18"/>
               </w:rPr>
-              <w:t>1.5 min</w:t>
+              <w:t>1.3 min</w:t>
             </w:r>
           </w:p>
         </w:tc>
@@ -2186,11 +2787,11 @@
           <w:p>
             <w:r>
               <w:rPr>
-                <w:b/>
+                <w:rFonts w:ascii="Calibri" w:hAnsi="Calibri"/>
                 <w:color w:val="1E293B"/>
                 <w:sz w:val="18"/>
               </w:rPr>
-              <w:t>0.5707</w:t>
+              <w:t>0.7228</w:t>
             </w:r>
           </w:p>
         </w:tc>
@@ -2208,179 +2809,7 @@
           <w:p>
             <w:r>
               <w:rPr>
-                <w:color w:val="1E293B"/>
-                <w:sz w:val="18"/>
-              </w:rPr>
-              <w:t>0.67 ms</w:t>
-            </w:r>
-          </w:p>
-        </w:tc>
-      </w:tr>
-      <w:tr>
-        <w:tc>
-          <w:tcPr>
-            <w:tcW w:type="dxa" w:w="1170"/>
-            <w:shd w:fill="F8FAFC"/>
-            <w:tcMar>
-              <w:top w:w="80" w:type="dxa"/>
-              <w:bottom w:w="80" w:type="dxa"/>
-              <w:left w:w="80" w:type="dxa"/>
-              <w:right w:w="80" w:type="dxa"/>
-            </w:tcMar>
-          </w:tcPr>
-          <w:p>
-            <w:r>
-              <w:rPr>
-                <w:b/>
-                <w:color w:val="1E293B"/>
-                <w:sz w:val="18"/>
-              </w:rPr>
-              <w:t>FairPool [No Fairness Ablation]</w:t>
-            </w:r>
-          </w:p>
-        </w:tc>
-        <w:tc>
-          <w:tcPr>
-            <w:tcW w:type="dxa" w:w="1170"/>
-            <w:shd w:fill="F8FAFC"/>
-            <w:tcMar>
-              <w:top w:w="80" w:type="dxa"/>
-              <w:bottom w:w="80" w:type="dxa"/>
-              <w:left w:w="80" w:type="dxa"/>
-              <w:right w:w="80" w:type="dxa"/>
-            </w:tcMar>
-          </w:tcPr>
-          <w:p>
-            <w:r>
-              <w:rPr>
-                <w:color w:val="1E293B"/>
-                <w:sz w:val="18"/>
-              </w:rPr>
-              <w:t>12</w:t>
-            </w:r>
-          </w:p>
-        </w:tc>
-        <w:tc>
-          <w:tcPr>
-            <w:tcW w:type="dxa" w:w="1170"/>
-            <w:shd w:fill="F8FAFC"/>
-            <w:tcMar>
-              <w:top w:w="80" w:type="dxa"/>
-              <w:bottom w:w="80" w:type="dxa"/>
-              <w:left w:w="80" w:type="dxa"/>
-              <w:right w:w="80" w:type="dxa"/>
-            </w:tcMar>
-          </w:tcPr>
-          <w:p>
-            <w:r>
-              <w:rPr>
-                <w:color w:val="1E293B"/>
-                <w:sz w:val="18"/>
-              </w:rPr>
-              <w:t>60.0%</w:t>
-            </w:r>
-          </w:p>
-        </w:tc>
-        <w:tc>
-          <w:tcPr>
-            <w:tcW w:type="dxa" w:w="1170"/>
-            <w:shd w:fill="F8FAFC"/>
-            <w:tcMar>
-              <w:top w:w="80" w:type="dxa"/>
-              <w:bottom w:w="80" w:type="dxa"/>
-              <w:left w:w="80" w:type="dxa"/>
-              <w:right w:w="80" w:type="dxa"/>
-            </w:tcMar>
-          </w:tcPr>
-          <w:p>
-            <w:r>
-              <w:rPr>
-                <w:color w:val="1E293B"/>
-                <w:sz w:val="18"/>
-              </w:rPr>
-              <w:t>39.6 km</w:t>
-            </w:r>
-          </w:p>
-        </w:tc>
-        <w:tc>
-          <w:tcPr>
-            <w:tcW w:type="dxa" w:w="1170"/>
-            <w:shd w:fill="F8FAFC"/>
-            <w:tcMar>
-              <w:top w:w="80" w:type="dxa"/>
-              <w:bottom w:w="80" w:type="dxa"/>
-              <w:left w:w="80" w:type="dxa"/>
-              <w:right w:w="80" w:type="dxa"/>
-            </w:tcMar>
-          </w:tcPr>
-          <w:p>
-            <w:r>
-              <w:rPr>
-                <w:b/>
-                <w:color w:val="1E293B"/>
-                <w:sz w:val="18"/>
-              </w:rPr>
-              <w:t>34.8%</w:t>
-            </w:r>
-          </w:p>
-        </w:tc>
-        <w:tc>
-          <w:tcPr>
-            <w:tcW w:type="dxa" w:w="1170"/>
-            <w:shd w:fill="F8FAFC"/>
-            <w:tcMar>
-              <w:top w:w="80" w:type="dxa"/>
-              <w:bottom w:w="80" w:type="dxa"/>
-              <w:left w:w="80" w:type="dxa"/>
-              <w:right w:w="80" w:type="dxa"/>
-            </w:tcMar>
-          </w:tcPr>
-          <w:p>
-            <w:r>
-              <w:rPr>
-                <w:color w:val="1E293B"/>
-                <w:sz w:val="18"/>
-              </w:rPr>
-              <w:t>1.3 min</w:t>
-            </w:r>
-          </w:p>
-        </w:tc>
-        <w:tc>
-          <w:tcPr>
-            <w:tcW w:type="dxa" w:w="1170"/>
-            <w:shd w:fill="F8FAFC"/>
-            <w:tcMar>
-              <w:top w:w="80" w:type="dxa"/>
-              <w:bottom w:w="80" w:type="dxa"/>
-              <w:left w:w="80" w:type="dxa"/>
-              <w:right w:w="80" w:type="dxa"/>
-            </w:tcMar>
-          </w:tcPr>
-          <w:p>
-            <w:r>
-              <w:rPr>
-                <w:b/>
-                <w:color w:val="1E293B"/>
-                <w:sz w:val="18"/>
-              </w:rPr>
-              <w:t>0.7228</w:t>
-            </w:r>
-          </w:p>
-        </w:tc>
-        <w:tc>
-          <w:tcPr>
-            <w:tcW w:type="dxa" w:w="1170"/>
-            <w:shd w:fill="F8FAFC"/>
-            <w:tcMar>
-              <w:top w:w="80" w:type="dxa"/>
-              <w:bottom w:w="80" w:type="dxa"/>
-              <w:left w:w="80" w:type="dxa"/>
-              <w:right w:w="80" w:type="dxa"/>
-            </w:tcMar>
-          </w:tcPr>
-          <w:p>
-            <w:r>
-              <w:rPr>
+                <w:rFonts w:ascii="Calibri" w:hAnsi="Calibri"/>
                 <w:color w:val="1E293B"/>
                 <w:sz w:val="18"/>
               </w:rPr>
@@ -2393,7 +2822,7 @@
         <w:tc>
           <w:tcPr>
             <w:tcW w:type="dxa" w:w="1170"/>
-            <w:shd w:fill="EFF6FF"/>
+            <w:shd w:fill="ECFDF5"/>
             <w:tcMar>
               <w:top w:w="80" w:type="dxa"/>
               <w:bottom w:w="80" w:type="dxa"/>
@@ -2404,8 +2833,9 @@
           <w:p>
             <w:r>
               <w:rPr>
+                <w:rFonts w:ascii="Calibri" w:hAnsi="Calibri"/>
                 <w:b/>
-                <w:color w:val="1E3A8A"/>
+                <w:color w:val="0B132B"/>
                 <w:sz w:val="18"/>
               </w:rPr>
               <w:t>★ FairPool [Dynamic Fairness]</w:t>
@@ -2415,7 +2845,7 @@
         <w:tc>
           <w:tcPr>
             <w:tcW w:type="dxa" w:w="1170"/>
-            <w:shd w:fill="EFF6FF"/>
+            <w:shd w:fill="ECFDF5"/>
             <w:tcMar>
               <w:top w:w="80" w:type="dxa"/>
               <w:bottom w:w="80" w:type="dxa"/>
@@ -2426,7 +2856,9 @@
           <w:p>
             <w:r>
               <w:rPr>
-                <w:color w:val="1E3A8A"/>
+                <w:rFonts w:ascii="Calibri" w:hAnsi="Calibri"/>
+                <w:b/>
+                <w:color w:val="0B132B"/>
                 <w:sz w:val="18"/>
               </w:rPr>
               <w:t>12</w:t>
@@ -2436,7 +2868,7 @@
         <w:tc>
           <w:tcPr>
             <w:tcW w:type="dxa" w:w="1170"/>
-            <w:shd w:fill="EFF6FF"/>
+            <w:shd w:fill="ECFDF5"/>
             <w:tcMar>
               <w:top w:w="80" w:type="dxa"/>
               <w:bottom w:w="80" w:type="dxa"/>
@@ -2447,7 +2879,9 @@
           <w:p>
             <w:r>
               <w:rPr>
-                <w:color w:val="1E3A8A"/>
+                <w:rFonts w:ascii="Calibri" w:hAnsi="Calibri"/>
+                <w:b/>
+                <w:color w:val="0B132B"/>
                 <w:sz w:val="18"/>
               </w:rPr>
               <w:t>63.3%</w:t>
@@ -2457,7 +2891,7 @@
         <w:tc>
           <w:tcPr>
             <w:tcW w:type="dxa" w:w="1170"/>
-            <w:shd w:fill="EFF6FF"/>
+            <w:shd w:fill="ECFDF5"/>
             <w:tcMar>
               <w:top w:w="80" w:type="dxa"/>
               <w:bottom w:w="80" w:type="dxa"/>
@@ -2468,7 +2902,9 @@
           <w:p>
             <w:r>
               <w:rPr>
-                <w:color w:val="1E3A8A"/>
+                <w:rFonts w:ascii="Calibri" w:hAnsi="Calibri"/>
+                <w:b/>
+                <w:color w:val="059669"/>
                 <w:sz w:val="18"/>
               </w:rPr>
               <w:t>40.3 km</w:t>
@@ -2478,7 +2914,7 @@
         <w:tc>
           <w:tcPr>
             <w:tcW w:type="dxa" w:w="1170"/>
-            <w:shd w:fill="EFF6FF"/>
+            <w:shd w:fill="ECFDF5"/>
             <w:tcMar>
               <w:top w:w="80" w:type="dxa"/>
               <w:bottom w:w="80" w:type="dxa"/>
@@ -2489,8 +2925,9 @@
           <w:p>
             <w:r>
               <w:rPr>
+                <w:rFonts w:ascii="Calibri" w:hAnsi="Calibri"/>
                 <w:b/>
-                <w:color w:val="1E3A8A"/>
+                <w:color w:val="059669"/>
                 <w:sz w:val="18"/>
               </w:rPr>
               <w:t>35.4%</w:t>
@@ -2500,7 +2937,7 @@
         <w:tc>
           <w:tcPr>
             <w:tcW w:type="dxa" w:w="1170"/>
-            <w:shd w:fill="EFF6FF"/>
+            <w:shd w:fill="ECFDF5"/>
             <w:tcMar>
               <w:top w:w="80" w:type="dxa"/>
               <w:bottom w:w="80" w:type="dxa"/>
@@ -2511,7 +2948,9 @@
           <w:p>
             <w:r>
               <w:rPr>
-                <w:color w:val="1E3A8A"/>
+                <w:rFonts w:ascii="Calibri" w:hAnsi="Calibri"/>
+                <w:b/>
+                <w:color w:val="0B132B"/>
                 <w:sz w:val="18"/>
               </w:rPr>
               <w:t>1.9 min</w:t>
@@ -2521,7 +2960,7 @@
         <w:tc>
           <w:tcPr>
             <w:tcW w:type="dxa" w:w="1170"/>
-            <w:shd w:fill="EFF6FF"/>
+            <w:shd w:fill="ECFDF5"/>
             <w:tcMar>
               <w:top w:w="80" w:type="dxa"/>
               <w:bottom w:w="80" w:type="dxa"/>
@@ -2532,8 +2971,9 @@
           <w:p>
             <w:r>
               <w:rPr>
+                <w:rFonts w:ascii="Calibri" w:hAnsi="Calibri"/>
                 <w:b/>
-                <w:color w:val="1E3A8A"/>
+                <w:color w:val="059669"/>
                 <w:sz w:val="18"/>
               </w:rPr>
               <w:t>0.5723</w:t>
@@ -2543,7 +2983,7 @@
         <w:tc>
           <w:tcPr>
             <w:tcW w:type="dxa" w:w="1170"/>
-            <w:shd w:fill="EFF6FF"/>
+            <w:shd w:fill="ECFDF5"/>
             <w:tcMar>
               <w:top w:w="80" w:type="dxa"/>
               <w:bottom w:w="80" w:type="dxa"/>
@@ -2554,7 +2994,9 @@
           <w:p>
             <w:r>
               <w:rPr>
-                <w:color w:val="1E3A8A"/>
+                <w:rFonts w:ascii="Calibri" w:hAnsi="Calibri"/>
+                <w:b/>
+                <w:color w:val="0B132B"/>
                 <w:sz w:val="18"/>
               </w:rPr>
               <w:t>244.7 ms</w:t>
@@ -2565,100 +3007,21 @@
     </w:tbl>
     <w:p>
       <w:pPr>
-        <w:spacing w:after="120"/>
+        <w:spacing w:after="160"/>
       </w:pPr>
     </w:p>
     <w:p>
       <w:pPr>
-        <w:keepNext/>
-        <w:spacing w:before="280" w:after="80"/>
+        <w:spacing w:before="240" w:after="80"/>
       </w:pPr>
       <w:r>
         <w:rPr>
-          <w:rFonts w:ascii="Arial" w:hAnsi="Arial"/>
+          <w:rFonts w:ascii="Calibri" w:hAnsi="Calibri"/>
           <w:b/>
-          <w:color w:val="0D9488"/>
-          <w:sz w:val="26"/>
+          <w:color w:val="0284C7"/>
+          <w:sz w:val="25"/>
         </w:rPr>
-        <w:t>5.1 Key Scientific Findings</w:t>
-      </w:r>
-    </w:p>
-    <w:p>
-      <w:pPr>
-        <w:pStyle w:val="ListBullet"/>
-        <w:spacing w:after="80" w:line="276" w:lineRule="auto"/>
-      </w:pPr>
-      <w:r>
-        <w:rPr>
-          <w:b/>
-          <w:color w:val="1E3A8A"/>
-        </w:rPr>
-        <w:t xml:space="preserve">Systemic Distance Reduction: </w:t>
-      </w:r>
-      <w:r>
-        <w:rPr>
-          <w:rFonts w:ascii="Calibri" w:hAnsi="Calibri"/>
-          <w:color w:val="1E293B"/>
-          <w:sz w:val="21"/>
-        </w:rPr>
-        <w:t>2.1x Higher Distance Efficiency: FairPool saves 35.4% of total commute driving distance (40.3 vehicle-kilometers saved per batch), compared to only 16.7% for greedy pairing.</w:t>
-      </w:r>
-    </w:p>
-    <w:p>
-      <w:pPr>
-        <w:pStyle w:val="ListBullet"/>
-        <w:spacing w:after="80" w:line="276" w:lineRule="auto"/>
-      </w:pPr>
-      <w:r>
-        <w:rPr>
-          <w:b/>
-          <w:color w:val="1E3A8A"/>
-        </w:rPr>
-        <w:t xml:space="preserve">Equity Rotation Prevents Burnout: </w:t>
-      </w:r>
-      <w:r>
-        <w:rPr>
-          <w:rFonts w:ascii="Calibri" w:hAnsi="Calibri"/>
-          <w:color w:val="1E293B"/>
-          <w:sz w:val="21"/>
-        </w:rPr>
-        <w:t>Gini Disparity Reduction from 0.748 to 0.572: Across a 5-day simulated commute week, dynamic detour penalties actively rotate detour burdens among drivers, successfully lowering cohort inequality without reducing passenger fulfillment.</w:t>
-      </w:r>
-    </w:p>
-    <w:p>
-      <w:pPr>
-        <w:pStyle w:val="ListBullet"/>
-        <w:spacing w:after="80" w:line="276" w:lineRule="auto"/>
-      </w:pPr>
-      <w:r>
-        <w:rPr>
-          <w:b/>
-          <w:color w:val="1E3A8A"/>
-        </w:rPr>
-        <w:t xml:space="preserve">Low Latency Scalability: </w:t>
-      </w:r>
-      <w:r>
-        <w:rPr>
-          <w:rFonts w:ascii="Calibri" w:hAnsi="Calibri"/>
-          <w:color w:val="1E293B"/>
-          <w:sz w:val="21"/>
-        </w:rPr>
-        <w:t>Sub-Second Response Time: Solving a full 30-request batch takes ~245 ms; 100-request batches complete in under 3.5 seconds, comfortably meeting the 10-second non-functional requirement (NFR-1).</w:t>
-      </w:r>
-    </w:p>
-    <w:p>
-      <w:pPr>
-        <w:keepNext/>
-        <w:spacing w:before="400" w:after="120"/>
-      </w:pPr>
-      <w:r>
-        <w:rPr>
-          <w:rFonts w:ascii="Arial" w:hAnsi="Arial"/>
-          <w:b/>
-          <w:color w:val="1E3A8A"/>
-          <w:sz w:val="36"/>
-        </w:rPr>
-        <w:t>6. System Architecture &amp; Modern Minimalist UI</w:t>
+        <w:t>6.1 Multi-Epoch 5-Day Detour Rotation Analysis</w:t>
       </w:r>
     </w:p>
     <w:p>
@@ -2671,22 +3034,35 @@
           <w:color w:val="1E293B"/>
           <w:sz w:val="22"/>
         </w:rPr>
-        <w:t>FairPool is engineered as a clean full-stack platform comprising an asynchronous Python FastAPI service and an interactive React 19 + TypeScript frontend with dynamic geographic map visualization.</w:t>
+        <w:t>A critical property of FairPool is cumulative equity over time. Across a simulated 5-day academic week of consecutive morning batches, standard matching without fairness tracking allows cumulative detour disparity to balloon to a Gini index of 0.748 (indicating severe burnout of a few drivers). Under FairPool's dynamic fairness engine, the detour penalty systematically rotates detours to rested drivers, lowering cohort Gini to 0.572 (a 23.5% equity improvement) without sacrificing matching throughput.</w:t>
       </w:r>
     </w:p>
     <w:p>
       <w:pPr>
-        <w:keepNext/>
-        <w:spacing w:before="280" w:after="80"/>
+        <w:spacing w:before="360" w:after="160"/>
       </w:pPr>
       <w:r>
         <w:rPr>
-          <w:rFonts w:ascii="Arial" w:hAnsi="Arial"/>
+          <w:rFonts w:ascii="Calibri" w:hAnsi="Calibri"/>
           <w:b/>
-          <w:color w:val="0D9488"/>
-          <w:sz w:val="26"/>
+          <w:color w:val="0B132B"/>
+          <w:sz w:val="32"/>
         </w:rPr>
-        <w:t>6.1 Dynamically Movable Map Pins &amp; 60 FPS Re-linking</w:t>
+        <w:t>7. System Architecture &amp; Modern UI Implementation</w:t>
+      </w:r>
+    </w:p>
+    <w:p>
+      <w:pPr>
+        <w:spacing w:before="240" w:after="80"/>
+      </w:pPr>
+      <w:r>
+        <w:rPr>
+          <w:rFonts w:ascii="Calibri" w:hAnsi="Calibri"/>
+          <w:b/>
+          <w:color w:val="0284C7"/>
+          <w:sz w:val="25"/>
+        </w:rPr>
+        <w:t>7.1 Backend Services (FastAPI)</w:t>
       </w:r>
     </w:p>
     <w:p>
@@ -2699,85 +3075,7 @@
           <w:color w:val="1E293B"/>
           <w:sz w:val="22"/>
         </w:rPr>
-        <w:t>A standout architectural capability of FairPool is its dynamically movable pin system:</w:t>
-      </w:r>
-    </w:p>
-    <w:p>
-      <w:pPr>
-        <w:pStyle w:val="ListBullet"/>
-        <w:spacing w:after="80" w:line="276" w:lineRule="auto"/>
-      </w:pPr>
-      <w:r>
-        <w:rPr>
-          <w:b/>
-          <w:color w:val="1E3A8A"/>
-        </w:rPr>
-        <w:t xml:space="preserve">Interactive Spatial Pin Manipulation: </w:t>
-      </w:r>
-      <w:r>
-        <w:rPr>
-          <w:rFonts w:ascii="Calibri" w:hAnsi="Calibri"/>
-          <w:color w:val="1E293B"/>
-          <w:sz w:val="21"/>
-        </w:rPr>
-        <w:t>All suburban pickup nodes (16 locations) and campus destinations (IIT Madras, Anna University, Tidel Park) are draggable anywhere on the interactive map canvas.</w:t>
-      </w:r>
-    </w:p>
-    <w:p>
-      <w:pPr>
-        <w:pStyle w:val="ListBullet"/>
-        <w:spacing w:after="80" w:line="276" w:lineRule="auto"/>
-      </w:pPr>
-      <w:r>
-        <w:rPr>
-          <w:b/>
-          <w:color w:val="1E3A8A"/>
-        </w:rPr>
-        <w:t xml:space="preserve">Real-Time Polyline Re-linking: </w:t>
-      </w:r>
-      <w:r>
-        <w:rPr>
-          <w:rFonts w:ascii="Calibri" w:hAnsi="Calibri"/>
-          <w:color w:val="1E293B"/>
-          <w:sz w:val="21"/>
-        </w:rPr>
-        <w:t>As a user drags a node across the city, Leaflet event listeners intercept drag events at 60 FPS, dynamically stretching and re-linking all connected road network edges and carpool polylines in real time.</w:t>
-      </w:r>
-    </w:p>
-    <w:p>
-      <w:pPr>
-        <w:pStyle w:val="ListBullet"/>
-        <w:spacing w:after="80" w:line="276" w:lineRule="auto"/>
-      </w:pPr>
-      <w:r>
-        <w:rPr>
-          <w:b/>
-          <w:color w:val="1E3A8A"/>
-        </w:rPr>
-        <w:t xml:space="preserve">Live Graph Engine Synchronization: </w:t>
-      </w:r>
-      <w:r>
-        <w:rPr>
-          <w:rFonts w:ascii="Calibri" w:hAnsi="Calibri"/>
-          <w:color w:val="1E293B"/>
-          <w:sz w:val="21"/>
-        </w:rPr>
-        <w:t>Upon releasing the pin, the frontend dispatches a PATCH /api/nodes/{node_id} request to the backend. The RoadNetwork engine updates the GPS coordinates, flushes cached matrices, and recomputes Haversine distances and Dijkstra travel times so subsequent matching runs utilize the updated geography.</w:t>
-      </w:r>
-    </w:p>
-    <w:p>
-      <w:pPr>
-        <w:keepNext/>
-        <w:spacing w:before="280" w:after="80"/>
-      </w:pPr>
-      <w:r>
-        <w:rPr>
-          <w:rFonts w:ascii="Arial" w:hAnsi="Arial"/>
-          <w:b/>
-          <w:color w:val="0D9488"/>
-          <w:sz w:val="26"/>
-        </w:rPr>
-        <w:t>6.2 Minimalist User Experience</w:t>
+        <w:t>• REST Endpoints: Exposes modular endpoints for road network serialization (/api/network), simulation state (/api/state), commuter request submissions (/api/requests), driver offer submissions (/api/offers), batch solving (/api/match), dynamic pin position updates (/api/nodes/{id}), and comparative benchmark execution (/api/benchmark).</w:t>
       </w:r>
     </w:p>
     <w:p>
@@ -2790,106 +3088,21 @@
           <w:color w:val="1E293B"/>
           <w:sz w:val="22"/>
         </w:rPr>
-        <w:t>To ensure the core algorithmic matching remains clear, the user interface was refactored with a focused layout:</w:t>
+        <w:t>• Domain Verification (FR-1): Pydantic validators strictly verify academic institutional email domains (@vitstudent.ac.in and @vit.ac.in) for student and faculty authentication.</w:t>
       </w:r>
     </w:p>
     <w:p>
       <w:pPr>
-        <w:pStyle w:val="ListBullet"/>
-        <w:spacing w:after="80" w:line="276" w:lineRule="auto"/>
+        <w:spacing w:before="240" w:after="80"/>
       </w:pPr>
       <w:r>
         <w:rPr>
+          <w:rFonts w:ascii="Calibri" w:hAnsi="Calibri"/>
           <w:b/>
-          <w:color w:val="1E3A8A"/>
+          <w:color w:val="0284C7"/>
+          <w:sz w:val="25"/>
         </w:rPr>
-        <w:t xml:space="preserve">• </w:t>
-      </w:r>
-      <w:r>
-        <w:rPr>
-          <w:rFonts w:ascii="Calibri" w:hAnsi="Calibri"/>
-          <w:color w:val="1E293B"/>
-          <w:sz w:val="21"/>
-        </w:rPr>
-        <w:t>Clean Top Control Strip: One-click Synthesize Rush, Run Match, and quick FairPool/Greedy algorithm toggling.</w:t>
-      </w:r>
-    </w:p>
-    <w:p>
-      <w:pPr>
-        <w:pStyle w:val="ListBullet"/>
-        <w:spacing w:after="80" w:line="276" w:lineRule="auto"/>
-      </w:pPr>
-      <w:r>
-        <w:rPr>
-          <w:b/>
-          <w:color w:val="1E3A8A"/>
-        </w:rPr>
-        <w:t xml:space="preserve">• </w:t>
-      </w:r>
-      <w:r>
-        <w:rPr>
-          <w:rFonts w:ascii="Calibri" w:hAnsi="Calibri"/>
-          <w:color w:val="1E293B"/>
-          <w:sz w:val="21"/>
-        </w:rPr>
-        <w:t>Compact KPI Ribbon: Sleek, single-row summary showing distance saved, commuters matched, detour Gini, and active pools.</w:t>
-      </w:r>
-    </w:p>
-    <w:p>
-      <w:pPr>
-        <w:pStyle w:val="ListBullet"/>
-        <w:spacing w:after="80" w:line="276" w:lineRule="auto"/>
-      </w:pPr>
-      <w:r>
-        <w:rPr>
-          <w:b/>
-          <w:color w:val="1E3A8A"/>
-        </w:rPr>
-        <w:t xml:space="preserve">• </w:t>
-      </w:r>
-      <w:r>
-        <w:rPr>
-          <w:rFonts w:ascii="Calibri" w:hAnsi="Calibri"/>
-          <w:color w:val="1E293B"/>
-          <w:sz w:val="21"/>
-        </w:rPr>
-        <w:t>Dedicated Carpool Manifest: Eliminates raw JSON queues and debug sliders, presenting intuitive carpool cards with passenger counts, detour minutes, and stop itineraries.</w:t>
-      </w:r>
-    </w:p>
-    <w:p>
-      <w:pPr>
-        <w:pStyle w:val="ListBullet"/>
-        <w:spacing w:after="80" w:line="276" w:lineRule="auto"/>
-      </w:pPr>
-      <w:r>
-        <w:rPr>
-          <w:b/>
-          <w:color w:val="1E3A8A"/>
-        </w:rPr>
-        <w:t xml:space="preserve">• </w:t>
-      </w:r>
-      <w:r>
-        <w:rPr>
-          <w:rFonts w:ascii="Calibri" w:hAnsi="Calibri"/>
-          <w:color w:val="1E293B"/>
-          <w:sz w:val="21"/>
-        </w:rPr>
-        <w:t>One-Click Google Maps Deep-Linking: Clicking any carpool opens live turn-by-turn navigation directly in Google Maps.</w:t>
-      </w:r>
-    </w:p>
-    <w:p>
-      <w:pPr>
-        <w:keepNext/>
-        <w:spacing w:before="400" w:after="120"/>
-      </w:pPr>
-      <w:r>
-        <w:rPr>
-          <w:rFonts w:ascii="Arial" w:hAnsi="Arial"/>
-          <w:b/>
-          <w:color w:val="1E3A8A"/>
-          <w:sz w:val="36"/>
-        </w:rPr>
-        <w:t>7. Testing &amp; Quality Assurance</w:t>
+        <w:t>7.2 Minimalist Frontend (React 19 + TypeScript)</w:t>
       </w:r>
     </w:p>
     <w:p>
@@ -2902,146 +3115,58 @@
           <w:color w:val="1E293B"/>
           <w:sz w:val="22"/>
         </w:rPr>
-        <w:t>FairPool adheres to rigorous software engineering and algorithm verification standards:</w:t>
+        <w:t>• Single Destination Enforcement: Dedicated exclusively to VIT Chennai on Vandalur-Kelambakkam Main Road. Destination selection in commuter booking forms is locked to VIT Chennai to eliminate multi-destination confusion.</w:t>
       </w:r>
     </w:p>
     <w:p>
       <w:pPr>
-        <w:pStyle w:val="ListBullet"/>
-        <w:spacing w:after="80" w:line="276" w:lineRule="auto"/>
+        <w:spacing w:after="120" w:line="276" w:lineRule="auto"/>
       </w:pPr>
-      <w:r>
-        <w:rPr>
-          <w:b/>
-          <w:color w:val="1E3A8A"/>
-        </w:rPr>
-        <w:t xml:space="preserve">1. Graph Engine Tests: </w:t>
-      </w:r>
       <w:r>
         <w:rPr>
           <w:rFonts w:ascii="Calibri" w:hAnsi="Calibri"/>
           <w:color w:val="1E293B"/>
-          <w:sz w:val="21"/>
+          <w:sz w:val="22"/>
         </w:rPr>
-        <w:t>test_graph.py: Verifies Haversine accuracy, Dijkstra shortest path optimality, and triangle inequality invariants.</w:t>
+        <w:t>• Dynamically Movable Pins: All 18 suburban pins and the VIT Chennai destination pin feature draggable Leaflet markers with 60 FPS visual line stretching, immediate tooltip feedback, and automatic backend graph synchronization.</w:t>
       </w:r>
     </w:p>
     <w:p>
       <w:pPr>
-        <w:pStyle w:val="ListBullet"/>
-        <w:spacing w:after="80" w:line="276" w:lineRule="auto"/>
+        <w:spacing w:after="120" w:line="276" w:lineRule="auto"/>
       </w:pPr>
-      <w:r>
-        <w:rPr>
-          <w:b/>
-          <w:color w:val="1E3A8A"/>
-        </w:rPr>
-        <w:t xml:space="preserve">2. Matching Invariant Tests: </w:t>
-      </w:r>
       <w:r>
         <w:rPr>
           <w:rFonts w:ascii="Calibri" w:hAnsi="Calibri"/>
           <w:color w:val="1E293B"/>
-          <w:sz w:val="21"/>
+          <w:sz w:val="22"/>
         </w:rPr>
-        <w:t>test_matching.py: Asserts pickup-before-dropoff precedence, vehicle capacity limits, detour bounds, and set packing uniqueness.</w:t>
+        <w:t>• Low-Profile KPI Ribbon: Replaced bloated multi-card bento grids with an elegant 48px stat bar displaying Distance Saved (-35%), Matched Commuters (63%), Gini Detour Equity (0.572), and Dispatched Pools.</w:t>
       </w:r>
     </w:p>
     <w:p>
       <w:pPr>
-        <w:pStyle w:val="ListBullet"/>
-        <w:spacing w:after="80" w:line="276" w:lineRule="auto"/>
+        <w:spacing w:after="120" w:line="276" w:lineRule="auto"/>
       </w:pPr>
-      <w:r>
-        <w:rPr>
-          <w:b/>
-          <w:color w:val="1E3A8A"/>
-        </w:rPr>
-        <w:t xml:space="preserve">3. Fairness Ledger Tests: </w:t>
-      </w:r>
       <w:r>
         <w:rPr>
           <w:rFonts w:ascii="Calibri" w:hAnsi="Calibri"/>
           <w:color w:val="1E293B"/>
-          <w:sz w:val="21"/>
+          <w:sz w:val="22"/>
         </w:rPr>
-        <w:t>test_fairness.py: Validates Gini coefficient bounds (0.0 for equal detours, 1.0 for extreme asymmetry) and penalty rotation.</w:t>
+        <w:t>• Focused Carpool Manifest: Eliminates multi-tab clutter, focusing exclusively on formed carpool cards with passenger counts, driver IDs, detour minutes, and 1-click Google Maps live driving directions.</w:t>
       </w:r>
     </w:p>
     <w:p>
       <w:pPr>
-        <w:pStyle w:val="ListBullet"/>
-        <w:spacing w:after="80" w:line="276" w:lineRule="auto"/>
+        <w:spacing w:before="360" w:after="160"/>
       </w:pPr>
       <w:r>
         <w:rPr>
+          <w:rFonts w:ascii="Calibri" w:hAnsi="Calibri"/>
           <w:b/>
-          <w:color w:val="1E3A8A"/>
-        </w:rPr>
-        <w:t xml:space="preserve">4. Benchmark Suite: </w:t>
-      </w:r>
-      <w:r>
-        <w:rPr>
-          <w:rFonts w:ascii="Calibri" w:hAnsi="Calibri"/>
-          <w:color w:val="1E293B"/>
-          <w:sz w:val="21"/>
-        </w:rPr>
-        <w:t>test_benchmark.py: Ensures reproducible numerical outputs across seeded runs and validates sub-10s NFR-1 performance.</w:t>
-      </w:r>
-    </w:p>
-    <w:p>
-      <w:pPr>
-        <w:pStyle w:val="ListBullet"/>
-        <w:spacing w:after="80" w:line="276" w:lineRule="auto"/>
-      </w:pPr>
-      <w:r>
-        <w:rPr>
-          <w:b/>
-          <w:color w:val="1E3A8A"/>
-        </w:rPr>
-        <w:t xml:space="preserve">5. API &amp; Integration: </w:t>
-      </w:r>
-      <w:r>
-        <w:rPr>
-          <w:rFonts w:ascii="Calibri" w:hAnsi="Calibri"/>
-          <w:color w:val="1E293B"/>
-          <w:sz w:val="21"/>
-        </w:rPr>
-        <w:t>test_api.py: Validates REST status codes, institutional email domain verification (FR-1), cancellation resiliency, and CSV exports.</w:t>
-      </w:r>
-    </w:p>
-    <w:p>
-      <w:pPr>
-        <w:pStyle w:val="ListBullet"/>
-        <w:spacing w:after="80" w:line="276" w:lineRule="auto"/>
-      </w:pPr>
-      <w:r>
-        <w:rPr>
-          <w:b/>
-          <w:color w:val="1E3A8A"/>
-        </w:rPr>
-        <w:t xml:space="preserve">6. Frontend Verification: </w:t>
-      </w:r>
-      <w:r>
-        <w:rPr>
-          <w:rFonts w:ascii="Calibri" w:hAnsi="Calibri"/>
-          <w:color w:val="1E293B"/>
-          <w:sz w:val="21"/>
-        </w:rPr>
-        <w:t>TypeScript tsc --noEmit (0 errors) and oxlint static code analysis (0 errors).</w:t>
-      </w:r>
-    </w:p>
-    <w:p>
-      <w:pPr>
-        <w:keepNext/>
-        <w:spacing w:before="400" w:after="120"/>
-      </w:pPr>
-      <w:r>
-        <w:rPr>
-          <w:rFonts w:ascii="Arial" w:hAnsi="Arial"/>
-          <w:b/>
-          <w:color w:val="1E3A8A"/>
-          <w:sz w:val="36"/>
+          <w:color w:val="0B132B"/>
+          <w:sz w:val="32"/>
         </w:rPr>
         <w:t>8. Conclusion &amp; Future Scope</w:t>
       </w:r>
@@ -3056,85 +3181,20 @@
           <w:color w:val="1E293B"/>
           <w:sz w:val="22"/>
         </w:rPr>
-        <w:t>FairPool successfully demonstrates how combinatorial optimization and graph algorithms can solve modern urban transportation dilemmas. By harmonizing maximum vehicle-kilometer savings with a dynamic fairness ledger, FairPool provides a sustainable, equitable framework for city-to-campus carpooling.</w:t>
+        <w:t>FairPool demonstrates that algorithmic ride-pooling can achieve both high environmental efficiency and long-term behavioral sustainability when detour equity is treated as a first-class mathematical objective. By tailoring the road network specifically to the Chennai-to-VIT Chennai Vandalur-Kelambakkam corridor, the system provides a robust blueprint for institutional micro-transit.</w:t>
       </w:r>
     </w:p>
     <w:p>
       <w:pPr>
-        <w:keepNext/>
-        <w:spacing w:before="280" w:after="80"/>
+        <w:spacing w:after="120" w:line="276" w:lineRule="auto"/>
       </w:pPr>
-      <w:r>
-        <w:rPr>
-          <w:rFonts w:ascii="Arial" w:hAnsi="Arial"/>
-          <w:b/>
-          <w:color w:val="0D9488"/>
-          <w:sz w:val="26"/>
-        </w:rPr>
-        <w:t>Future Enhancements</w:t>
-      </w:r>
-    </w:p>
-    <w:p>
-      <w:pPr>
-        <w:pStyle w:val="ListBullet"/>
-        <w:spacing w:after="80" w:line="276" w:lineRule="auto"/>
-      </w:pPr>
-      <w:r>
-        <w:rPr>
-          <w:b/>
-          <w:color w:val="1E3A8A"/>
-        </w:rPr>
-        <w:t xml:space="preserve">• </w:t>
-      </w:r>
       <w:r>
         <w:rPr>
           <w:rFonts w:ascii="Calibri" w:hAnsi="Calibri"/>
           <w:color w:val="1E293B"/>
-          <w:sz w:val="21"/>
+          <w:sz w:val="22"/>
         </w:rPr>
-        <w:t>Mid-Route Dynamic Re-routing: Incorporating dynamic insertions for last-minute commuter requests while in transit.</w:t>
-      </w:r>
-    </w:p>
-    <w:p>
-      <w:pPr>
-        <w:pStyle w:val="ListBullet"/>
-        <w:spacing w:after="80" w:line="276" w:lineRule="auto"/>
-      </w:pPr>
-      <w:r>
-        <w:rPr>
-          <w:b/>
-          <w:color w:val="1E3A8A"/>
-        </w:rPr>
-        <w:t xml:space="preserve">• </w:t>
-      </w:r>
-      <w:r>
-        <w:rPr>
-          <w:rFonts w:ascii="Calibri" w:hAnsi="Calibri"/>
-          <w:color w:val="1E293B"/>
-          <w:sz w:val="21"/>
-        </w:rPr>
-        <w:t>Multimodal Transit Integration: Matching commuters to suburban Metro rail stations as intermodal park-and-ride feeder points.</w:t>
-      </w:r>
-    </w:p>
-    <w:p>
-      <w:pPr>
-        <w:pStyle w:val="ListBullet"/>
-        <w:spacing w:after="80" w:line="276" w:lineRule="auto"/>
-      </w:pPr>
-      <w:r>
-        <w:rPr>
-          <w:b/>
-          <w:color w:val="1E3A8A"/>
-        </w:rPr>
-        <w:t xml:space="preserve">• </w:t>
-      </w:r>
-      <w:r>
-        <w:rPr>
-          <w:rFonts w:ascii="Calibri" w:hAnsi="Calibri"/>
-          <w:color w:val="1E293B"/>
-          <w:sz w:val="21"/>
-        </w:rPr>
-        <w:t>Electric Vehicle (EV) State-of-Charge Routing: Adding battery capacity and charging detour constraints into the Branch-and-Bound search.</w:t>
+        <w:t>Future research directions include: (1) Dynamic en-route re-optimization handling real-time GPS delays and vehicle cancellations, (2) Integration with Chennai suburban railway gateways (Tambaram / Perungalathur stations) for hybrid train-carpool transfers, and (3) Zero-Knowledge Proofs for privacy-preserving commuter origin verification.</w:t>
       </w:r>
     </w:p>
     <w:sectPr>

</xml_diff>